<commit_message>
Reto profesional tema 3 Finalizado
</commit_message>
<xml_diff>
--- a/digitalizacion/RETO PROFESIONAL TEMA 3/Desafio Profesional Tema3 Digitalización.docx
+++ b/digitalizacion/RETO PROFESIONAL TEMA 3/Desafio Profesional Tema3 Digitalización.docx
@@ -287,7 +287,23 @@
                 <w:rFonts w:ascii="Poppins" w:hAnsi="Poppins" w:cs="Poppins"/>
                 <w:color w:val="FFFFFF" w:themeColor="background1"/>
               </w:rPr>
-              <w:t>Precio por TB(Aprox)</w:t>
+              <w:t>Precio por TB(</w:t>
+            </w:r>
+            <w:proofErr w:type="spellStart"/>
+            <w:r>
+              <w:rPr>
+                <w:rFonts w:ascii="Poppins" w:hAnsi="Poppins" w:cs="Poppins"/>
+                <w:color w:val="FFFFFF" w:themeColor="background1"/>
+              </w:rPr>
+              <w:t>Aprox</w:t>
+            </w:r>
+            <w:proofErr w:type="spellEnd"/>
+            <w:r>
+              <w:rPr>
+                <w:rFonts w:ascii="Poppins" w:hAnsi="Poppins" w:cs="Poppins"/>
+                <w:color w:val="FFFFFF" w:themeColor="background1"/>
+              </w:rPr>
+              <w:t>)</w:t>
             </w:r>
           </w:p>
         </w:tc>
@@ -1612,6 +1628,465 @@
     </w:p>
     <w:p>
       <w:pPr>
+        <w:ind w:left="708"/>
+        <w:rPr>
+          <w:rFonts w:ascii="Poppins" w:hAnsi="Poppins" w:cs="Poppins"/>
+          <w:color w:val="000000" w:themeColor="text1"/>
+        </w:rPr>
+      </w:pPr>
+      <w:r>
+        <w:rPr>
+          <w:rFonts w:ascii="Poppins" w:hAnsi="Poppins" w:cs="Poppins"/>
+          <w:color w:val="000000" w:themeColor="text1"/>
+        </w:rPr>
+        <w:t>Si intentáramos utilizar únicamente el plan gratuito de 15 GB de Google Drive, no sería viable.</w:t>
+      </w:r>
+    </w:p>
+    <w:p>
+      <w:pPr>
+        <w:ind w:left="708"/>
+        <w:jc w:val="center"/>
+        <w:rPr>
+          <w:rFonts w:ascii="Poppins" w:hAnsi="Poppins" w:cs="Poppins"/>
+          <w:b/>
+          <w:bCs/>
+          <w:color w:val="000000" w:themeColor="text1"/>
+        </w:rPr>
+      </w:pPr>
+      <w:r>
+        <w:rPr>
+          <w:rFonts w:ascii="Poppins" w:hAnsi="Poppins" w:cs="Poppins"/>
+          <w:color w:val="000000" w:themeColor="text1"/>
+        </w:rPr>
+        <w:t xml:space="preserve">15 GB (Disponibles) – 76 GB (Necesarios) = </w:t>
+      </w:r>
+      <w:r>
+        <w:rPr>
+          <w:rFonts w:ascii="Poppins" w:hAnsi="Poppins" w:cs="Poppins"/>
+          <w:b/>
+          <w:bCs/>
+          <w:color w:val="000000" w:themeColor="text1"/>
+        </w:rPr>
+        <w:t>-61 GB</w:t>
+      </w:r>
+    </w:p>
+    <w:p>
+      <w:pPr>
+        <w:ind w:left="708"/>
+        <w:rPr>
+          <w:rFonts w:ascii="Poppins" w:hAnsi="Poppins" w:cs="Poppins"/>
+          <w:color w:val="000000" w:themeColor="text1"/>
+        </w:rPr>
+      </w:pPr>
+      <w:r>
+        <w:rPr>
+          <w:rFonts w:ascii="Poppins" w:hAnsi="Poppins" w:cs="Poppins"/>
+          <w:b/>
+          <w:bCs/>
+          <w:color w:val="000000" w:themeColor="text1"/>
+        </w:rPr>
+        <w:t>Nos faltarían 61 GB de espacio.</w:t>
+      </w:r>
+      <w:r>
+        <w:rPr>
+          <w:rFonts w:ascii="Poppins" w:hAnsi="Poppins" w:cs="Poppins"/>
+          <w:color w:val="000000" w:themeColor="text1"/>
+        </w:rPr>
+        <w:t xml:space="preserve"> Esto significa que no podríamos subir ni siquiera los vídeos, y tendríamos que borrar gran parte del archivo fotográfico de los pacientes.</w:t>
+      </w:r>
+    </w:p>
+    <w:p>
+      <w:pPr>
+        <w:pStyle w:val="Prrafodelista"/>
+        <w:numPr>
+          <w:ilvl w:val="0"/>
+          <w:numId w:val="1"/>
+        </w:numPr>
+        <w:rPr>
+          <w:rFonts w:ascii="Poppins" w:hAnsi="Poppins" w:cs="Poppins"/>
+          <w:b/>
+          <w:bCs/>
+          <w:color w:val="526DFF"/>
+          <w:sz w:val="28"/>
+          <w:szCs w:val="28"/>
+        </w:rPr>
+      </w:pPr>
+      <w:r>
+        <w:rPr>
+          <w:rFonts w:ascii="Poppins" w:hAnsi="Poppins" w:cs="Poppins"/>
+          <w:b/>
+          <w:bCs/>
+          <w:color w:val="526DFF"/>
+          <w:sz w:val="28"/>
+          <w:szCs w:val="28"/>
+        </w:rPr>
+        <w:t>Elección y Justificación</w:t>
+      </w:r>
+    </w:p>
+    <w:p>
+      <w:pPr>
+        <w:ind w:left="708"/>
+        <w:rPr>
+          <w:rFonts w:ascii="Poppins" w:hAnsi="Poppins" w:cs="Poppins"/>
+          <w:color w:val="000000" w:themeColor="text1"/>
+        </w:rPr>
+      </w:pPr>
+      <w:r>
+        <w:rPr>
+          <w:rFonts w:ascii="Poppins" w:hAnsi="Poppins" w:cs="Poppins"/>
+          <w:color w:val="000000" w:themeColor="text1"/>
+        </w:rPr>
+        <w:t xml:space="preserve">Tras analizar las opciones profesionales, hemos seleccionado el plan </w:t>
+      </w:r>
+      <w:r>
+        <w:rPr>
+          <w:rFonts w:ascii="Poppins" w:hAnsi="Poppins" w:cs="Poppins"/>
+          <w:b/>
+          <w:bCs/>
+          <w:color w:val="000000" w:themeColor="text1"/>
+        </w:rPr>
+        <w:t>OneDrive para la Empresa (Plan 1)</w:t>
+      </w:r>
+      <w:r>
+        <w:rPr>
+          <w:rFonts w:ascii="Poppins" w:hAnsi="Poppins" w:cs="Poppins"/>
+          <w:color w:val="000000" w:themeColor="text1"/>
+        </w:rPr>
+        <w:t>.</w:t>
+      </w:r>
+      <w:r>
+        <w:rPr>
+          <w:rFonts w:ascii="Poppins" w:hAnsi="Poppins" w:cs="Poppins"/>
+          <w:color w:val="000000" w:themeColor="text1"/>
+        </w:rPr>
+        <w:t xml:space="preserve"> </w:t>
+      </w:r>
+    </w:p>
+    <w:p>
+      <w:pPr>
+        <w:jc w:val="center"/>
+        <w:rPr>
+          <w:rFonts w:ascii="Poppins" w:hAnsi="Poppins" w:cs="Poppins"/>
+          <w:color w:val="000000" w:themeColor="text1"/>
+        </w:rPr>
+      </w:pPr>
+    </w:p>
+    <w:p>
+      <w:pPr>
+        <w:jc w:val="center"/>
+        <w:rPr>
+          <w:rFonts w:ascii="Poppins" w:hAnsi="Poppins" w:cs="Poppins"/>
+          <w:color w:val="000000" w:themeColor="text1"/>
+        </w:rPr>
+      </w:pPr>
+    </w:p>
+    <w:p>
+      <w:pPr>
+        <w:jc w:val="center"/>
+        <w:rPr>
+          <w:rFonts w:ascii="Poppins" w:hAnsi="Poppins" w:cs="Poppins"/>
+          <w:color w:val="000000" w:themeColor="text1"/>
+        </w:rPr>
+      </w:pPr>
+      <w:r>
+        <w:drawing>
+          <wp:inline distT="0" distB="0" distL="0" distR="0" wp14:anchorId="68CBCC26" wp14:editId="6D63AD56">
+            <wp:extent cx="3305636" cy="4296375"/>
+            <wp:effectExtent l="0" t="0" r="0" b="9525"/>
+            <wp:docPr id="14" name="Imagen 14"/>
+            <wp:cNvGraphicFramePr>
+              <a:graphicFrameLocks xmlns:a="http://schemas.openxmlformats.org/drawingml/2006/main" noChangeAspect="1"/>
+            </wp:cNvGraphicFramePr>
+            <a:graphic xmlns:a="http://schemas.openxmlformats.org/drawingml/2006/main">
+              <a:graphicData uri="http://schemas.openxmlformats.org/drawingml/2006/picture">
+                <pic:pic xmlns:pic="http://schemas.openxmlformats.org/drawingml/2006/picture">
+                  <pic:nvPicPr>
+                    <pic:cNvPr id="1" name=""/>
+                    <pic:cNvPicPr/>
+                  </pic:nvPicPr>
+                  <pic:blipFill>
+                    <a:blip r:embed="rId21"/>
+                    <a:stretch>
+                      <a:fillRect/>
+                    </a:stretch>
+                  </pic:blipFill>
+                  <pic:spPr>
+                    <a:xfrm>
+                      <a:off x="0" y="0"/>
+                      <a:ext cx="3305636" cy="4296375"/>
+                    </a:xfrm>
+                    <a:prstGeom prst="rect">
+                      <a:avLst/>
+                    </a:prstGeom>
+                  </pic:spPr>
+                </pic:pic>
+              </a:graphicData>
+            </a:graphic>
+          </wp:inline>
+        </w:drawing>
+      </w:r>
+    </w:p>
+    <w:p>
+      <w:pPr>
+        <w:jc w:val="center"/>
+        <w:rPr>
+          <w:rFonts w:ascii="Poppins" w:hAnsi="Poppins" w:cs="Poppins"/>
+          <w:color w:val="000000" w:themeColor="text1"/>
+        </w:rPr>
+      </w:pPr>
+    </w:p>
+    <w:p>
+      <w:pPr>
+        <w:pStyle w:val="Prrafodelista"/>
+        <w:rPr>
+          <w:rFonts w:ascii="Poppins" w:hAnsi="Poppins" w:cs="Poppins"/>
+          <w:b/>
+          <w:bCs/>
+          <w:color w:val="000000" w:themeColor="text1"/>
+          <w:sz w:val="28"/>
+          <w:szCs w:val="28"/>
+        </w:rPr>
+      </w:pPr>
+      <w:r>
+        <w:rPr>
+          <w:rFonts w:ascii="Poppins" w:hAnsi="Poppins" w:cs="Poppins"/>
+          <w:b/>
+          <w:bCs/>
+          <w:color w:val="000000" w:themeColor="text1"/>
+          <w:sz w:val="28"/>
+          <w:szCs w:val="28"/>
+        </w:rPr>
+        <w:t>¿Por qué es la opción más rentable y adecuada?</w:t>
+      </w:r>
+    </w:p>
+    <w:p>
+      <w:pPr>
+        <w:pStyle w:val="Prrafodelista"/>
+        <w:numPr>
+          <w:ilvl w:val="0"/>
+          <w:numId w:val="2"/>
+        </w:numPr>
+        <w:rPr>
+          <w:rFonts w:ascii="Poppins" w:hAnsi="Poppins" w:cs="Poppins"/>
+          <w:color w:val="000000" w:themeColor="text1"/>
+        </w:rPr>
+      </w:pPr>
+      <w:r>
+        <w:rPr>
+          <w:rFonts w:ascii="Poppins" w:hAnsi="Poppins" w:cs="Poppins"/>
+          <w:b/>
+          <w:bCs/>
+          <w:color w:val="000000" w:themeColor="text1"/>
+        </w:rPr>
+        <w:t>Cobertura de espacio:</w:t>
+      </w:r>
+      <w:r>
+        <w:rPr>
+          <w:rFonts w:ascii="Poppins" w:hAnsi="Poppins" w:cs="Poppins"/>
+          <w:color w:val="000000" w:themeColor="text1"/>
+        </w:rPr>
+        <w:t xml:space="preserve"> </w:t>
+      </w:r>
+      <w:r>
+        <w:rPr>
+          <w:rFonts w:ascii="Poppins" w:hAnsi="Poppins" w:cs="Poppins"/>
+          <w:color w:val="000000" w:themeColor="text1"/>
+        </w:rPr>
+        <w:t xml:space="preserve">Necesitamos almacenar </w:t>
+      </w:r>
+      <w:r>
+        <w:rPr>
+          <w:rFonts w:ascii="Poppins" w:hAnsi="Poppins" w:cs="Poppins"/>
+          <w:b/>
+          <w:bCs/>
+          <w:color w:val="000000" w:themeColor="text1"/>
+        </w:rPr>
+        <w:t>76 GB</w:t>
+      </w:r>
+      <w:r>
+        <w:rPr>
+          <w:rFonts w:ascii="Poppins" w:hAnsi="Poppins" w:cs="Poppins"/>
+          <w:color w:val="000000" w:themeColor="text1"/>
+        </w:rPr>
+        <w:t xml:space="preserve">. Este plan ofrece </w:t>
+      </w:r>
+      <w:r>
+        <w:rPr>
+          <w:rFonts w:ascii="Poppins" w:hAnsi="Poppins" w:cs="Poppins"/>
+          <w:b/>
+          <w:bCs/>
+          <w:color w:val="000000" w:themeColor="text1"/>
+        </w:rPr>
+        <w:t>1 TB</w:t>
+      </w:r>
+      <w:r>
+        <w:rPr>
+          <w:rFonts w:ascii="Poppins" w:hAnsi="Poppins" w:cs="Poppins"/>
+          <w:color w:val="000000" w:themeColor="text1"/>
+        </w:rPr>
+        <w:t>, lo que nos deja más de 900 GB libres para el crecimiento futuro de la clínica sin tener que cambiar de tarifa en años.</w:t>
+      </w:r>
+      <w:r>
+        <w:rPr>
+          <w:rFonts w:ascii="Poppins" w:hAnsi="Poppins" w:cs="Poppins"/>
+          <w:b/>
+          <w:bCs/>
+          <w:color w:val="000000" w:themeColor="text1"/>
+        </w:rPr>
+        <w:t xml:space="preserve"> </w:t>
+      </w:r>
+    </w:p>
+    <w:p>
+      <w:pPr>
+        <w:pStyle w:val="Prrafodelista"/>
+        <w:numPr>
+          <w:ilvl w:val="0"/>
+          <w:numId w:val="2"/>
+        </w:numPr>
+        <w:rPr>
+          <w:rFonts w:ascii="Poppins" w:hAnsi="Poppins" w:cs="Poppins"/>
+          <w:color w:val="000000" w:themeColor="text1"/>
+        </w:rPr>
+      </w:pPr>
+      <w:r>
+        <w:rPr>
+          <w:rFonts w:ascii="Poppins" w:hAnsi="Poppins" w:cs="Poppins"/>
+          <w:b/>
+          <w:bCs/>
+          <w:color w:val="000000" w:themeColor="text1"/>
+        </w:rPr>
+        <w:t>Rentabilidad</w:t>
+      </w:r>
+      <w:r>
+        <w:rPr>
+          <w:rFonts w:ascii="Poppins" w:hAnsi="Poppins" w:cs="Poppins"/>
+          <w:b/>
+          <w:bCs/>
+          <w:color w:val="000000" w:themeColor="text1"/>
+        </w:rPr>
+        <w:t>:</w:t>
+      </w:r>
+      <w:r>
+        <w:rPr>
+          <w:rFonts w:ascii="Poppins" w:hAnsi="Poppins" w:cs="Poppins"/>
+          <w:b/>
+          <w:bCs/>
+          <w:color w:val="000000" w:themeColor="text1"/>
+        </w:rPr>
+        <w:t xml:space="preserve"> </w:t>
+      </w:r>
+      <w:r>
+        <w:rPr>
+          <w:rFonts w:ascii="Poppins" w:hAnsi="Poppins" w:cs="Poppins"/>
+          <w:color w:val="000000" w:themeColor="text1"/>
+        </w:rPr>
+        <w:t xml:space="preserve">El plan de </w:t>
+      </w:r>
+      <w:r>
+        <w:rPr>
+          <w:rFonts w:ascii="Poppins" w:hAnsi="Poppins" w:cs="Poppins"/>
+          <w:b/>
+          <w:bCs/>
+          <w:color w:val="000000" w:themeColor="text1"/>
+        </w:rPr>
+        <w:t>4,70 €</w:t>
+      </w:r>
+      <w:r>
+        <w:rPr>
+          <w:rFonts w:ascii="Poppins" w:hAnsi="Poppins" w:cs="Poppins"/>
+          <w:color w:val="000000" w:themeColor="text1"/>
+        </w:rPr>
+        <w:t xml:space="preserve"> es la opción profesional más económica del mercado que garantiza el cumplimiento normativo.</w:t>
+      </w:r>
+      <w:r>
+        <w:rPr>
+          <w:rFonts w:ascii="Poppins" w:hAnsi="Poppins" w:cs="Poppins"/>
+          <w:b/>
+          <w:bCs/>
+          <w:color w:val="000000" w:themeColor="text1"/>
+        </w:rPr>
+        <w:t xml:space="preserve"> </w:t>
+      </w:r>
+    </w:p>
+    <w:p>
+      <w:pPr>
+        <w:pStyle w:val="Prrafodelista"/>
+        <w:numPr>
+          <w:ilvl w:val="0"/>
+          <w:numId w:val="2"/>
+        </w:numPr>
+        <w:rPr>
+          <w:rFonts w:ascii="Poppins" w:hAnsi="Poppins" w:cs="Poppins"/>
+          <w:color w:val="000000" w:themeColor="text1"/>
+        </w:rPr>
+      </w:pPr>
+      <w:r>
+        <w:rPr>
+          <w:rFonts w:ascii="Poppins" w:hAnsi="Poppins" w:cs="Poppins"/>
+          <w:b/>
+          <w:bCs/>
+          <w:color w:val="000000" w:themeColor="text1"/>
+        </w:rPr>
+        <w:t>Seguridad</w:t>
+      </w:r>
+      <w:r>
+        <w:rPr>
+          <w:rFonts w:ascii="Poppins" w:hAnsi="Poppins" w:cs="Poppins"/>
+          <w:b/>
+          <w:bCs/>
+          <w:color w:val="000000" w:themeColor="text1"/>
+        </w:rPr>
+        <w:t>:</w:t>
+      </w:r>
+      <w:r>
+        <w:rPr>
+          <w:rFonts w:ascii="Poppins" w:hAnsi="Poppins" w:cs="Poppins"/>
+          <w:color w:val="000000" w:themeColor="text1"/>
+        </w:rPr>
+        <w:t xml:space="preserve"> </w:t>
+      </w:r>
+      <w:r>
+        <w:rPr>
+          <w:rFonts w:ascii="Poppins" w:hAnsi="Poppins" w:cs="Poppins"/>
+          <w:color w:val="000000" w:themeColor="text1"/>
+        </w:rPr>
+        <w:t xml:space="preserve">A diferencia de los planes "Familiares" o gratuitos, este plan incluye auditoría de archivos y cumplimiento de la </w:t>
+      </w:r>
+      <w:r>
+        <w:rPr>
+          <w:rFonts w:ascii="Poppins" w:hAnsi="Poppins" w:cs="Poppins"/>
+          <w:b/>
+          <w:bCs/>
+          <w:color w:val="000000" w:themeColor="text1"/>
+        </w:rPr>
+        <w:t>RGPD</w:t>
+      </w:r>
+      <w:r>
+        <w:rPr>
+          <w:rFonts w:ascii="Poppins" w:hAnsi="Poppins" w:cs="Poppins"/>
+          <w:color w:val="000000" w:themeColor="text1"/>
+        </w:rPr>
+        <w:t xml:space="preserve"> y </w:t>
+      </w:r>
+      <w:r>
+        <w:rPr>
+          <w:rFonts w:ascii="Poppins" w:hAnsi="Poppins" w:cs="Poppins"/>
+          <w:b/>
+          <w:bCs/>
+          <w:color w:val="000000" w:themeColor="text1"/>
+        </w:rPr>
+        <w:t>HIPAA</w:t>
+      </w:r>
+      <w:r>
+        <w:rPr>
+          <w:rFonts w:ascii="Poppins" w:hAnsi="Poppins" w:cs="Poppins"/>
+          <w:color w:val="000000" w:themeColor="text1"/>
+        </w:rPr>
+        <w:t>, requisito legal indispensable para manejar datos de salud de pacientes.</w:t>
+      </w:r>
+    </w:p>
+    <w:p>
+      <w:pPr>
         <w:rPr>
           <w:rFonts w:ascii="Poppins" w:hAnsi="Poppins" w:cs="Poppins"/>
           <w:sz w:val="36"/>
@@ -1621,6 +2096,7 @@
     </w:p>
     <w:p>
       <w:pPr>
+        <w:jc w:val="center"/>
         <w:rPr>
           <w:rFonts w:ascii="Poppins" w:hAnsi="Poppins" w:cs="Poppins"/>
           <w:b/>
@@ -1630,162 +2106,1081 @@
           <w:szCs w:val="36"/>
         </w:rPr>
       </w:pPr>
-    </w:p>
-    <w:p>
-      <w:pPr>
-        <w:tabs>
-          <w:tab w:val="left" w:pos="7284"/>
-        </w:tabs>
-        <w:rPr>
-          <w:rFonts w:ascii="Poppins" w:hAnsi="Poppins" w:cs="Poppins"/>
+      <w:r>
+        <w:rPr>
+          <w:rFonts w:ascii="Poppins" w:hAnsi="Poppins" w:cs="Poppins"/>
+          <w:b/>
+          <w:bCs/>
+          <w:color w:val="00B050"/>
           <w:sz w:val="36"/>
           <w:szCs w:val="36"/>
         </w:rPr>
-      </w:pPr>
-      <w:r>
+        <w:lastRenderedPageBreak/>
+        <w:t>Seguridad y Copias de Seguridad</w:t>
+      </w:r>
+    </w:p>
+    <w:p>
+      <w:pPr>
+        <w:tabs>
+          <w:tab w:val="left" w:pos="7284"/>
+        </w:tabs>
+        <w:rPr>
+          <w:rFonts w:ascii="Poppins" w:hAnsi="Poppins" w:cs="Poppins"/>
+          <w:color w:val="000000" w:themeColor="text1"/>
+        </w:rPr>
+      </w:pPr>
+      <w:r>
+        <w:rPr>
+          <w:rFonts w:ascii="Poppins" w:hAnsi="Poppins" w:cs="Poppins"/>
+          <w:color w:val="000000" w:themeColor="text1"/>
+        </w:rPr>
+        <w:t xml:space="preserve">Como </w:t>
+      </w:r>
+      <w:r>
+        <w:rPr>
+          <w:rFonts w:ascii="Poppins" w:hAnsi="Poppins" w:cs="Poppins"/>
+          <w:b/>
+          <w:bCs/>
+          <w:color w:val="000000" w:themeColor="text1"/>
+        </w:rPr>
+        <w:t>Clínica Médica</w:t>
+      </w:r>
+      <w:r>
+        <w:rPr>
+          <w:rFonts w:ascii="Poppins" w:hAnsi="Poppins" w:cs="Poppins"/>
+          <w:color w:val="000000" w:themeColor="text1"/>
+        </w:rPr>
+        <w:t>, la seguridad no es una opción, es una obligación legal. Manejamos datos de salud especialmente protegidos por la ley. Para tomar la decisión correcta, hemos investigado primero las medidas de seguridad de las principales alternativas y finalmente hemos detallado nuestra elección.</w:t>
+      </w:r>
+    </w:p>
+    <w:p>
+      <w:pPr>
+        <w:tabs>
+          <w:tab w:val="left" w:pos="7284"/>
+        </w:tabs>
+        <w:rPr>
+          <w:rFonts w:ascii="Poppins" w:hAnsi="Poppins" w:cs="Poppins"/>
+          <w:color w:val="000000" w:themeColor="text1"/>
+        </w:rPr>
+      </w:pPr>
+    </w:p>
+    <w:p>
+      <w:pPr>
+        <w:pStyle w:val="Prrafodelista"/>
+        <w:numPr>
+          <w:ilvl w:val="0"/>
+          <w:numId w:val="4"/>
+        </w:numPr>
+        <w:tabs>
+          <w:tab w:val="left" w:pos="7284"/>
+        </w:tabs>
+        <w:rPr>
+          <w:rFonts w:ascii="Poppins" w:hAnsi="Poppins" w:cs="Poppins"/>
+          <w:b/>
+          <w:bCs/>
+          <w:color w:val="526DFF"/>
+          <w:sz w:val="28"/>
+          <w:szCs w:val="28"/>
+        </w:rPr>
+      </w:pPr>
+      <w:r>
+        <w:rPr>
+          <w:rFonts w:ascii="Poppins" w:hAnsi="Poppins" w:cs="Poppins"/>
+          <w:b/>
+          <w:bCs/>
+          <w:color w:val="526DFF"/>
+          <w:sz w:val="28"/>
+          <w:szCs w:val="28"/>
+        </w:rPr>
+        <w:t>Análisis de seguridad de las alternativas investigadas</w:t>
+      </w:r>
+    </w:p>
+    <w:p>
+      <w:pPr>
+        <w:pStyle w:val="Prrafodelista"/>
+        <w:tabs>
+          <w:tab w:val="left" w:pos="7284"/>
+        </w:tabs>
+        <w:rPr>
+          <w:rFonts w:ascii="Poppins" w:hAnsi="Poppins" w:cs="Poppins"/>
+          <w:color w:val="000000" w:themeColor="text1"/>
+        </w:rPr>
+      </w:pPr>
+      <w:r>
+        <w:rPr>
+          <w:rFonts w:ascii="Poppins" w:hAnsi="Poppins" w:cs="Poppins"/>
+          <w:color w:val="000000" w:themeColor="text1"/>
+        </w:rPr>
+        <w:t>Antes de elegir, analizamos cómo protegen los datos los otros proveedores:</w:t>
+      </w:r>
+    </w:p>
+    <w:p>
+      <w:pPr>
+        <w:pStyle w:val="Prrafodelista"/>
+        <w:tabs>
+          <w:tab w:val="left" w:pos="7284"/>
+        </w:tabs>
+        <w:rPr>
+          <w:rFonts w:ascii="Poppins" w:hAnsi="Poppins" w:cs="Poppins"/>
+          <w:color w:val="000000" w:themeColor="text1"/>
+        </w:rPr>
+      </w:pPr>
+    </w:p>
+    <w:p>
+      <w:pPr>
+        <w:pStyle w:val="Prrafodelista"/>
+        <w:numPr>
+          <w:ilvl w:val="0"/>
+          <w:numId w:val="5"/>
+        </w:numPr>
+        <w:tabs>
+          <w:tab w:val="left" w:pos="7284"/>
+        </w:tabs>
+        <w:rPr>
+          <w:rFonts w:ascii="Poppins" w:hAnsi="Poppins" w:cs="Poppins"/>
+          <w:color w:val="000000" w:themeColor="text1"/>
+        </w:rPr>
+      </w:pPr>
+      <w:r>
+        <w:rPr>
+          <w:rFonts w:ascii="Poppins" w:hAnsi="Poppins" w:cs="Poppins"/>
+          <w:b/>
+          <w:bCs/>
+          <w:color w:val="000000" w:themeColor="text1"/>
+        </w:rPr>
+        <w:t>Google Drive:</w:t>
+      </w:r>
+      <w:r>
+        <w:rPr>
+          <w:rFonts w:ascii="Poppins" w:hAnsi="Poppins" w:cs="Poppins"/>
+          <w:color w:val="000000" w:themeColor="text1"/>
+        </w:rPr>
+        <w:t xml:space="preserve"> Utiliza cifrado HTTPS en tránsito y AES-128/256 en reposo. Escanea archivos en busca de malware automáticamente. </w:t>
+      </w:r>
+      <w:r>
+        <w:rPr>
+          <w:rFonts w:ascii="Poppins" w:hAnsi="Poppins" w:cs="Poppins"/>
+          <w:i/>
+          <w:iCs/>
+          <w:color w:val="000000" w:themeColor="text1"/>
+        </w:rPr>
+        <w:t>Descarte:</w:t>
+      </w:r>
+      <w:r>
+        <w:rPr>
+          <w:rFonts w:ascii="Poppins" w:hAnsi="Poppins" w:cs="Poppins"/>
+          <w:color w:val="000000" w:themeColor="text1"/>
+        </w:rPr>
+        <w:t xml:space="preserve"> Aunque es seguro, la gestión de permisos en su versión básica es menos detallada que la necesaria para nuestros roles médicos.</w:t>
+      </w:r>
+    </w:p>
+    <w:p>
+      <w:pPr>
+        <w:pStyle w:val="Prrafodelista"/>
+        <w:tabs>
+          <w:tab w:val="left" w:pos="7284"/>
+        </w:tabs>
+        <w:rPr>
+          <w:rFonts w:ascii="Poppins" w:hAnsi="Poppins" w:cs="Poppins"/>
+          <w:color w:val="000000" w:themeColor="text1"/>
+        </w:rPr>
+      </w:pPr>
+    </w:p>
+    <w:p>
+      <w:pPr>
+        <w:pStyle w:val="Prrafodelista"/>
+        <w:numPr>
+          <w:ilvl w:val="0"/>
+          <w:numId w:val="5"/>
+        </w:numPr>
+        <w:tabs>
+          <w:tab w:val="left" w:pos="7284"/>
+        </w:tabs>
+        <w:rPr>
+          <w:rFonts w:ascii="Poppins" w:hAnsi="Poppins" w:cs="Poppins"/>
+          <w:color w:val="000000" w:themeColor="text1"/>
+        </w:rPr>
+      </w:pPr>
+      <w:r>
+        <w:rPr>
+          <w:rFonts w:ascii="Poppins" w:hAnsi="Poppins" w:cs="Poppins"/>
+          <w:b/>
+          <w:bCs/>
+          <w:color w:val="000000" w:themeColor="text1"/>
+        </w:rPr>
+        <w:t>Dropbox:</w:t>
+      </w:r>
+      <w:r>
+        <w:rPr>
+          <w:rFonts w:ascii="Poppins" w:hAnsi="Poppins" w:cs="Poppins"/>
+          <w:color w:val="000000" w:themeColor="text1"/>
+        </w:rPr>
+        <w:t xml:space="preserve"> Protege con cifrado AES-256 bits y ofrece "Dropbox </w:t>
+      </w:r>
+      <w:proofErr w:type="spellStart"/>
+      <w:r>
+        <w:rPr>
+          <w:rFonts w:ascii="Poppins" w:hAnsi="Poppins" w:cs="Poppins"/>
+          <w:color w:val="000000" w:themeColor="text1"/>
+        </w:rPr>
+        <w:t>Vault</w:t>
+      </w:r>
+      <w:proofErr w:type="spellEnd"/>
+      <w:r>
+        <w:rPr>
+          <w:rFonts w:ascii="Poppins" w:hAnsi="Poppins" w:cs="Poppins"/>
+          <w:color w:val="000000" w:themeColor="text1"/>
+        </w:rPr>
+        <w:t xml:space="preserve">" (carpeta con PIN extra). </w:t>
+      </w:r>
+      <w:r>
+        <w:rPr>
+          <w:rFonts w:ascii="Poppins" w:hAnsi="Poppins" w:cs="Poppins"/>
+          <w:i/>
+          <w:iCs/>
+          <w:color w:val="000000" w:themeColor="text1"/>
+        </w:rPr>
+        <w:t>Descarte:</w:t>
+      </w:r>
+      <w:r>
+        <w:rPr>
+          <w:rFonts w:ascii="Poppins" w:hAnsi="Poppins" w:cs="Poppins"/>
+          <w:color w:val="000000" w:themeColor="text1"/>
+        </w:rPr>
+        <w:t xml:space="preserve"> Las funciones de seguridad avanzada (como la gestión de auditoría) encarecen el precio significativamente respecto a nuestra elección.</w:t>
+      </w:r>
+    </w:p>
+    <w:p>
+      <w:pPr>
+        <w:pStyle w:val="Prrafodelista"/>
+        <w:rPr>
+          <w:rFonts w:ascii="Poppins" w:hAnsi="Poppins" w:cs="Poppins"/>
+          <w:color w:val="000000" w:themeColor="text1"/>
+        </w:rPr>
+      </w:pPr>
+    </w:p>
+    <w:p>
+      <w:pPr>
+        <w:pStyle w:val="Prrafodelista"/>
+        <w:tabs>
+          <w:tab w:val="left" w:pos="7284"/>
+        </w:tabs>
+        <w:rPr>
+          <w:rFonts w:ascii="Poppins" w:hAnsi="Poppins" w:cs="Poppins"/>
+          <w:color w:val="000000" w:themeColor="text1"/>
+        </w:rPr>
+      </w:pPr>
+    </w:p>
+    <w:p>
+      <w:pPr>
+        <w:pStyle w:val="Prrafodelista"/>
+        <w:numPr>
+          <w:ilvl w:val="0"/>
+          <w:numId w:val="5"/>
+        </w:numPr>
+        <w:tabs>
+          <w:tab w:val="left" w:pos="7284"/>
+        </w:tabs>
+        <w:rPr>
+          <w:rFonts w:ascii="Poppins" w:hAnsi="Poppins" w:cs="Poppins"/>
+          <w:b/>
+          <w:bCs/>
+          <w:color w:val="526DFF"/>
+        </w:rPr>
+      </w:pPr>
+      <w:r>
+        <w:rPr>
+          <w:rFonts w:ascii="Poppins" w:hAnsi="Poppins" w:cs="Poppins"/>
+          <w:b/>
+          <w:bCs/>
+          <w:color w:val="000000" w:themeColor="text1"/>
+        </w:rPr>
+        <w:t>MEGA:</w:t>
+      </w:r>
+      <w:r>
+        <w:rPr>
+          <w:rFonts w:ascii="Poppins" w:hAnsi="Poppins" w:cs="Poppins"/>
+          <w:color w:val="000000" w:themeColor="text1"/>
+        </w:rPr>
+        <w:t xml:space="preserve"> Su punto fuerte es el cifrado "Zero-</w:t>
+      </w:r>
+      <w:proofErr w:type="spellStart"/>
+      <w:r>
+        <w:rPr>
+          <w:rFonts w:ascii="Poppins" w:hAnsi="Poppins" w:cs="Poppins"/>
+          <w:color w:val="000000" w:themeColor="text1"/>
+        </w:rPr>
+        <w:t>Knowledge</w:t>
+      </w:r>
+      <w:proofErr w:type="spellEnd"/>
+      <w:r>
+        <w:rPr>
+          <w:rFonts w:ascii="Poppins" w:hAnsi="Poppins" w:cs="Poppins"/>
+          <w:color w:val="000000" w:themeColor="text1"/>
+        </w:rPr>
+        <w:t xml:space="preserve">" (solo el usuario tiene la clave). </w:t>
+      </w:r>
+      <w:r>
+        <w:rPr>
+          <w:rFonts w:ascii="Poppins" w:hAnsi="Poppins" w:cs="Poppins"/>
+          <w:i/>
+          <w:iCs/>
+          <w:color w:val="000000" w:themeColor="text1"/>
+        </w:rPr>
+        <w:t>Descarte:</w:t>
+      </w:r>
+      <w:r>
+        <w:rPr>
+          <w:rFonts w:ascii="Poppins" w:hAnsi="Poppins" w:cs="Poppins"/>
+          <w:color w:val="000000" w:themeColor="text1"/>
+        </w:rPr>
+        <w:t xml:space="preserve"> Esta seguridad extrema dificulta la recuperación de cuentas si un empleado pierde la contraseña y complica la colaboración en tiempo real en los historiales.</w:t>
+      </w:r>
+    </w:p>
+    <w:p>
+      <w:pPr>
+        <w:tabs>
+          <w:tab w:val="left" w:pos="7284"/>
+        </w:tabs>
+        <w:rPr>
+          <w:rFonts w:ascii="Poppins" w:hAnsi="Poppins" w:cs="Poppins"/>
+          <w:b/>
+          <w:bCs/>
+          <w:color w:val="526DFF"/>
+        </w:rPr>
+      </w:pPr>
+    </w:p>
+    <w:p>
+      <w:pPr>
+        <w:pStyle w:val="Prrafodelista"/>
+        <w:numPr>
+          <w:ilvl w:val="0"/>
+          <w:numId w:val="4"/>
+        </w:numPr>
+        <w:tabs>
+          <w:tab w:val="left" w:pos="7284"/>
+        </w:tabs>
+        <w:rPr>
+          <w:rFonts w:ascii="Poppins" w:hAnsi="Poppins" w:cs="Poppins"/>
+          <w:b/>
+          <w:bCs/>
+          <w:color w:val="526DFF"/>
+          <w:sz w:val="28"/>
+          <w:szCs w:val="28"/>
+        </w:rPr>
+      </w:pPr>
+      <w:r>
+        <w:rPr>
+          <w:rFonts w:ascii="Poppins" w:hAnsi="Poppins" w:cs="Poppins"/>
+          <w:b/>
+          <w:bCs/>
+          <w:color w:val="526DFF"/>
+          <w:sz w:val="28"/>
+          <w:szCs w:val="28"/>
+        </w:rPr>
+        <w:lastRenderedPageBreak/>
+        <w:t xml:space="preserve">La Elección Segura: Microsoft </w:t>
+      </w:r>
+      <w:proofErr w:type="spellStart"/>
+      <w:r>
+        <w:rPr>
+          <w:rFonts w:ascii="Poppins" w:hAnsi="Poppins" w:cs="Poppins"/>
+          <w:b/>
+          <w:bCs/>
+          <w:color w:val="526DFF"/>
+          <w:sz w:val="28"/>
+          <w:szCs w:val="28"/>
+        </w:rPr>
+        <w:t>Onedrive</w:t>
+      </w:r>
+      <w:proofErr w:type="spellEnd"/>
+      <w:r>
+        <w:rPr>
+          <w:rFonts w:ascii="Poppins" w:hAnsi="Poppins" w:cs="Poppins"/>
+          <w:b/>
+          <w:bCs/>
+          <w:color w:val="526DFF"/>
+          <w:sz w:val="28"/>
+          <w:szCs w:val="28"/>
+        </w:rPr>
+        <w:t xml:space="preserve"> para la Empresa</w:t>
+      </w:r>
+    </w:p>
+    <w:p>
+      <w:pPr>
+        <w:pStyle w:val="Prrafodelista"/>
+        <w:tabs>
+          <w:tab w:val="left" w:pos="7284"/>
+        </w:tabs>
+        <w:rPr>
+          <w:rFonts w:ascii="Poppins" w:hAnsi="Poppins" w:cs="Poppins"/>
+          <w:color w:val="000000" w:themeColor="text1"/>
+        </w:rPr>
+      </w:pPr>
+      <w:r>
+        <w:rPr>
+          <w:rFonts w:ascii="Poppins" w:hAnsi="Poppins" w:cs="Poppins"/>
+          <w:color w:val="000000" w:themeColor="text1"/>
+        </w:rPr>
+        <w:t xml:space="preserve">Tras la comparativa, hemos elegido OneDrive </w:t>
+      </w:r>
+      <w:r>
+        <w:rPr>
+          <w:rFonts w:ascii="Poppins" w:hAnsi="Poppins" w:cs="Poppins"/>
+          <w:color w:val="000000" w:themeColor="text1"/>
+        </w:rPr>
+        <w:t xml:space="preserve">para la empresa </w:t>
+      </w:r>
+      <w:r>
+        <w:rPr>
+          <w:rFonts w:ascii="Poppins" w:hAnsi="Poppins" w:cs="Poppins"/>
+          <w:color w:val="000000" w:themeColor="text1"/>
+        </w:rPr>
+        <w:t>porque ofrece la mejor protección específica para empresas. A diferencia de las versiones personales (Google Drive Personal o Dropbox Basic), este servicio está construido sobre la infraestructura de seguridad de Azure.</w:t>
+      </w:r>
+    </w:p>
+    <w:p>
+      <w:pPr>
+        <w:pStyle w:val="Prrafodelista"/>
+        <w:tabs>
+          <w:tab w:val="left" w:pos="7284"/>
+        </w:tabs>
+        <w:rPr>
+          <w:rFonts w:ascii="Poppins" w:hAnsi="Poppins" w:cs="Poppins"/>
+          <w:color w:val="000000" w:themeColor="text1"/>
+        </w:rPr>
+      </w:pPr>
+    </w:p>
+    <w:p>
+      <w:pPr>
+        <w:pStyle w:val="Prrafodelista"/>
+        <w:tabs>
+          <w:tab w:val="left" w:pos="7284"/>
+        </w:tabs>
+        <w:rPr>
+          <w:rFonts w:ascii="Poppins" w:hAnsi="Poppins" w:cs="Poppins"/>
+          <w:b/>
+          <w:bCs/>
+          <w:color w:val="000000" w:themeColor="text1"/>
+        </w:rPr>
+      </w:pPr>
+      <w:r>
+        <w:rPr>
+          <w:rFonts w:ascii="Poppins" w:hAnsi="Poppins" w:cs="Poppins"/>
+          <w:b/>
+          <w:bCs/>
+          <w:color w:val="000000" w:themeColor="text1"/>
+        </w:rPr>
+        <w:t>Medidas de seguridad clave implementadas:</w:t>
+      </w:r>
+    </w:p>
+    <w:p>
+      <w:pPr>
+        <w:pStyle w:val="Prrafodelista"/>
+        <w:tabs>
+          <w:tab w:val="left" w:pos="7284"/>
+        </w:tabs>
+        <w:rPr>
+          <w:rFonts w:ascii="Poppins" w:hAnsi="Poppins" w:cs="Poppins"/>
+          <w:color w:val="000000" w:themeColor="text1"/>
+        </w:rPr>
+      </w:pPr>
+      <w:r>
+        <w:rPr>
+          <w:rFonts w:ascii="Poppins" w:hAnsi="Poppins" w:cs="Poppins"/>
+          <w:b/>
+          <w:bCs/>
+          <w:color w:val="000000" w:themeColor="text1"/>
+        </w:rPr>
+        <w:t>1. Cumplimiento Normativo (RGPD y LOPD)</w:t>
+      </w:r>
+      <w:r>
+        <w:rPr>
+          <w:rFonts w:ascii="Poppins" w:hAnsi="Poppins" w:cs="Poppins"/>
+          <w:color w:val="000000" w:themeColor="text1"/>
+        </w:rPr>
+        <w:t>:</w:t>
+      </w:r>
+      <w:r>
+        <w:rPr>
+          <w:rFonts w:ascii="Poppins" w:hAnsi="Poppins" w:cs="Poppins"/>
+          <w:color w:val="000000" w:themeColor="text1"/>
+        </w:rPr>
+        <w:t xml:space="preserve"> El servicio cumple estrictamente con el Reglamento General de Protección de Datos (RGPD) de la UE. Microsoft firma un contrato de encargado del tratamiento de datos (DPA), obligatorio para operar legalmente. Además, cuenta con certificaciones ISO 27001 (Seguridad de la Información) y HIPAA (Estándar internacional de salud).</w:t>
+      </w:r>
+    </w:p>
+    <w:p>
+      <w:pPr>
+        <w:pStyle w:val="Prrafodelista"/>
+        <w:tabs>
+          <w:tab w:val="left" w:pos="7284"/>
+        </w:tabs>
+        <w:rPr>
+          <w:rFonts w:ascii="Poppins" w:hAnsi="Poppins" w:cs="Poppins"/>
+          <w:color w:val="000000" w:themeColor="text1"/>
+        </w:rPr>
+      </w:pPr>
+    </w:p>
+    <w:p>
+      <w:pPr>
+        <w:pStyle w:val="Prrafodelista"/>
+        <w:tabs>
+          <w:tab w:val="left" w:pos="7284"/>
+        </w:tabs>
+        <w:rPr>
+          <w:rFonts w:ascii="Poppins" w:hAnsi="Poppins" w:cs="Poppins"/>
+          <w:color w:val="000000" w:themeColor="text1"/>
+        </w:rPr>
+      </w:pPr>
+      <w:r>
+        <w:rPr>
+          <w:rFonts w:ascii="Poppins" w:hAnsi="Poppins" w:cs="Poppins"/>
+          <w:b/>
+          <w:bCs/>
+          <w:color w:val="000000" w:themeColor="text1"/>
+        </w:rPr>
+        <w:t>2. Cifrado de Datos (</w:t>
+      </w:r>
+      <w:proofErr w:type="spellStart"/>
+      <w:r>
+        <w:rPr>
+          <w:rFonts w:ascii="Poppins" w:hAnsi="Poppins" w:cs="Poppins"/>
+          <w:b/>
+          <w:bCs/>
+          <w:color w:val="000000" w:themeColor="text1"/>
+        </w:rPr>
+        <w:t>Encryption</w:t>
+      </w:r>
+      <w:proofErr w:type="spellEnd"/>
+      <w:r>
+        <w:rPr>
+          <w:rFonts w:ascii="Poppins" w:hAnsi="Poppins" w:cs="Poppins"/>
+          <w:b/>
+          <w:bCs/>
+          <w:color w:val="000000" w:themeColor="text1"/>
+        </w:rPr>
+        <w:t>)</w:t>
+      </w:r>
+      <w:r>
+        <w:rPr>
+          <w:rFonts w:ascii="Poppins" w:hAnsi="Poppins" w:cs="Poppins"/>
+          <w:color w:val="000000" w:themeColor="text1"/>
+        </w:rPr>
+        <w:t>:</w:t>
+      </w:r>
+      <w:r>
+        <w:rPr>
+          <w:rFonts w:ascii="Poppins" w:hAnsi="Poppins" w:cs="Poppins"/>
+          <w:color w:val="000000" w:themeColor="text1"/>
+        </w:rPr>
+        <w:t xml:space="preserve"> Los historiales médicos están blindados en todo momento:</w:t>
+      </w:r>
+    </w:p>
+    <w:p>
+      <w:pPr>
+        <w:pStyle w:val="Prrafodelista"/>
+        <w:numPr>
+          <w:ilvl w:val="0"/>
+          <w:numId w:val="6"/>
+        </w:numPr>
+        <w:tabs>
+          <w:tab w:val="left" w:pos="7284"/>
+        </w:tabs>
+        <w:rPr>
+          <w:rFonts w:ascii="Poppins" w:hAnsi="Poppins" w:cs="Poppins"/>
+          <w:color w:val="000000" w:themeColor="text1"/>
+        </w:rPr>
+      </w:pPr>
+      <w:r>
+        <w:rPr>
+          <w:rFonts w:ascii="Poppins" w:hAnsi="Poppins" w:cs="Poppins"/>
+          <w:b/>
+          <w:bCs/>
+          <w:color w:val="000000" w:themeColor="text1"/>
+        </w:rPr>
+        <w:t>En tránsito:</w:t>
+      </w:r>
+      <w:r>
+        <w:rPr>
+          <w:rFonts w:ascii="Poppins" w:hAnsi="Poppins" w:cs="Poppins"/>
+          <w:color w:val="000000" w:themeColor="text1"/>
+        </w:rPr>
+        <w:t xml:space="preserve"> Al subir una radiografía, viaja cifrada mediante túneles TLS/SSL.</w:t>
+      </w:r>
+    </w:p>
+    <w:p>
+      <w:pPr>
+        <w:pStyle w:val="Prrafodelista"/>
+        <w:numPr>
+          <w:ilvl w:val="0"/>
+          <w:numId w:val="6"/>
+        </w:numPr>
+        <w:tabs>
+          <w:tab w:val="left" w:pos="7284"/>
+        </w:tabs>
+        <w:rPr>
+          <w:rFonts w:ascii="Poppins" w:hAnsi="Poppins" w:cs="Poppins"/>
+          <w:color w:val="000000" w:themeColor="text1"/>
+        </w:rPr>
+      </w:pPr>
+      <w:r>
+        <w:rPr>
+          <w:rFonts w:ascii="Poppins" w:hAnsi="Poppins" w:cs="Poppins"/>
+          <w:b/>
+          <w:bCs/>
+          <w:color w:val="000000" w:themeColor="text1"/>
+        </w:rPr>
+        <w:t>En reposo:</w:t>
+      </w:r>
+      <w:r>
+        <w:rPr>
+          <w:rFonts w:ascii="Poppins" w:hAnsi="Poppins" w:cs="Poppins"/>
+          <w:color w:val="000000" w:themeColor="text1"/>
+        </w:rPr>
+        <w:t xml:space="preserve"> En los servidores, se cifra con BitLocker (AES-256). Incluso si robaran físicamente el disco duro del centro de datos, la información sería ilegible.</w:t>
+      </w:r>
+    </w:p>
+    <w:p>
+      <w:pPr>
+        <w:pStyle w:val="Prrafodelista"/>
+        <w:tabs>
+          <w:tab w:val="left" w:pos="7284"/>
+        </w:tabs>
+        <w:ind w:left="1068"/>
+        <w:rPr>
+          <w:rFonts w:ascii="Poppins" w:hAnsi="Poppins" w:cs="Poppins"/>
+          <w:color w:val="000000" w:themeColor="text1"/>
+        </w:rPr>
+      </w:pPr>
+    </w:p>
+    <w:p>
+      <w:pPr>
+        <w:pStyle w:val="Prrafodelista"/>
+        <w:tabs>
+          <w:tab w:val="left" w:pos="7284"/>
+        </w:tabs>
+        <w:rPr>
+          <w:rFonts w:ascii="Poppins" w:hAnsi="Poppins" w:cs="Poppins"/>
+          <w:color w:val="000000" w:themeColor="text1"/>
+        </w:rPr>
+      </w:pPr>
+      <w:r>
+        <w:rPr>
+          <w:rFonts w:ascii="Poppins" w:hAnsi="Poppins" w:cs="Poppins"/>
+          <w:b/>
+          <w:bCs/>
+          <w:color w:val="000000" w:themeColor="text1"/>
+        </w:rPr>
+        <w:t>3. Control de Acceso Basado en Roles (RBAC)</w:t>
+      </w:r>
+      <w:r>
+        <w:rPr>
+          <w:rFonts w:ascii="Poppins" w:hAnsi="Poppins" w:cs="Poppins"/>
+          <w:b/>
+          <w:bCs/>
+          <w:color w:val="000000" w:themeColor="text1"/>
+        </w:rPr>
+        <w:t>:</w:t>
+      </w:r>
+      <w:r>
+        <w:rPr>
+          <w:rFonts w:ascii="Poppins" w:hAnsi="Poppins" w:cs="Poppins"/>
+          <w:color w:val="000000" w:themeColor="text1"/>
+        </w:rPr>
+        <w:t xml:space="preserve"> Vital para la clínica, permite definir qué ve cada empleado:</w:t>
+      </w:r>
+    </w:p>
+    <w:p>
+      <w:pPr>
+        <w:pStyle w:val="Prrafodelista"/>
+        <w:numPr>
+          <w:ilvl w:val="0"/>
+          <w:numId w:val="7"/>
+        </w:numPr>
+        <w:tabs>
+          <w:tab w:val="left" w:pos="7284"/>
+        </w:tabs>
+        <w:rPr>
+          <w:rFonts w:ascii="Poppins" w:hAnsi="Poppins" w:cs="Poppins"/>
+          <w:color w:val="000000" w:themeColor="text1"/>
+        </w:rPr>
+      </w:pPr>
+      <w:r>
+        <w:rPr>
+          <w:rFonts w:ascii="Poppins" w:hAnsi="Poppins" w:cs="Poppins"/>
+          <w:b/>
+          <w:bCs/>
+          <w:color w:val="000000" w:themeColor="text1"/>
+        </w:rPr>
+        <w:t>Administrativos:</w:t>
+      </w:r>
+      <w:r>
+        <w:rPr>
+          <w:rFonts w:ascii="Poppins" w:hAnsi="Poppins" w:cs="Poppins"/>
+          <w:color w:val="000000" w:themeColor="text1"/>
+        </w:rPr>
+        <w:t xml:space="preserve"> Acceso restringido a facturación y citas.</w:t>
+      </w:r>
+    </w:p>
+    <w:p>
+      <w:pPr>
+        <w:pStyle w:val="Prrafodelista"/>
+        <w:numPr>
+          <w:ilvl w:val="0"/>
+          <w:numId w:val="7"/>
+        </w:numPr>
+        <w:tabs>
+          <w:tab w:val="left" w:pos="7284"/>
+        </w:tabs>
+        <w:rPr>
+          <w:rFonts w:ascii="Poppins" w:hAnsi="Poppins" w:cs="Poppins"/>
+          <w:color w:val="000000" w:themeColor="text1"/>
+        </w:rPr>
+      </w:pPr>
+      <w:r>
+        <w:rPr>
+          <w:rFonts w:ascii="Poppins" w:hAnsi="Poppins" w:cs="Poppins"/>
+          <w:b/>
+          <w:bCs/>
+          <w:color w:val="000000" w:themeColor="text1"/>
+        </w:rPr>
+        <w:t xml:space="preserve">Médicos: </w:t>
+      </w:r>
+      <w:r>
+        <w:rPr>
+          <w:rFonts w:ascii="Poppins" w:hAnsi="Poppins" w:cs="Poppins"/>
+          <w:color w:val="000000" w:themeColor="text1"/>
+        </w:rPr>
+        <w:t>Acceso total a historiales (Lectura/Escritura).</w:t>
+      </w:r>
+    </w:p>
+    <w:p>
+      <w:pPr>
+        <w:pStyle w:val="Prrafodelista"/>
+        <w:numPr>
+          <w:ilvl w:val="0"/>
+          <w:numId w:val="7"/>
+        </w:numPr>
+        <w:tabs>
+          <w:tab w:val="left" w:pos="7284"/>
+        </w:tabs>
+        <w:rPr>
+          <w:rFonts w:ascii="Poppins" w:hAnsi="Poppins" w:cs="Poppins"/>
+          <w:color w:val="000000" w:themeColor="text1"/>
+        </w:rPr>
+      </w:pPr>
+      <w:r>
+        <w:rPr>
+          <w:rFonts w:ascii="Poppins" w:hAnsi="Poppins" w:cs="Poppins"/>
+          <w:b/>
+          <w:bCs/>
+          <w:color w:val="000000" w:themeColor="text1"/>
+        </w:rPr>
+        <w:t>Pacientes:</w:t>
+      </w:r>
+      <w:r>
+        <w:rPr>
+          <w:rFonts w:ascii="Poppins" w:hAnsi="Poppins" w:cs="Poppins"/>
+          <w:color w:val="000000" w:themeColor="text1"/>
+        </w:rPr>
+        <w:t xml:space="preserve"> Se generan enlaces seguros temporales con contraseña para descargar analíticas, sin dar acceso a la red interna.</w:t>
+      </w:r>
+    </w:p>
+    <w:p>
+      <w:pPr>
+        <w:tabs>
+          <w:tab w:val="left" w:pos="7284"/>
+        </w:tabs>
+        <w:rPr>
+          <w:rFonts w:ascii="Poppins" w:hAnsi="Poppins" w:cs="Poppins"/>
+          <w:color w:val="000000" w:themeColor="text1"/>
+        </w:rPr>
+      </w:pPr>
+    </w:p>
+    <w:p>
+      <w:pPr>
+        <w:pStyle w:val="Prrafodelista"/>
+        <w:tabs>
+          <w:tab w:val="left" w:pos="7284"/>
+        </w:tabs>
+        <w:rPr>
+          <w:rFonts w:ascii="Poppins" w:hAnsi="Poppins" w:cs="Poppins"/>
+          <w:color w:val="000000" w:themeColor="text1"/>
+        </w:rPr>
+      </w:pPr>
+      <w:r>
+        <w:rPr>
+          <w:noProof/>
+        </w:rPr>
+        <w:lastRenderedPageBreak/>
+        <w:drawing>
+          <wp:anchor distT="0" distB="0" distL="114300" distR="114300" simplePos="0" relativeHeight="251659264" behindDoc="1" locked="0" layoutInCell="1" allowOverlap="1" wp14:anchorId="126A3C48" wp14:editId="13DF7EF2">
+            <wp:simplePos x="0" y="0"/>
+            <wp:positionH relativeFrom="margin">
+              <wp:align>center</wp:align>
+            </wp:positionH>
+            <wp:positionV relativeFrom="paragraph">
+              <wp:posOffset>1469693</wp:posOffset>
+            </wp:positionV>
+            <wp:extent cx="5107234" cy="3450866"/>
+            <wp:effectExtent l="0" t="0" r="0" b="0"/>
+            <wp:wrapTight wrapText="bothSides">
+              <wp:wrapPolygon edited="0">
+                <wp:start x="0" y="0"/>
+                <wp:lineTo x="0" y="21465"/>
+                <wp:lineTo x="21514" y="21465"/>
+                <wp:lineTo x="21514" y="0"/>
+                <wp:lineTo x="0" y="0"/>
+              </wp:wrapPolygon>
+            </wp:wrapTight>
+            <wp:docPr id="17" name="Imagen 17" descr="Signs of Ransomware detected, no progress further possible - Microsoft Q&amp;A"/>
+            <wp:cNvGraphicFramePr>
+              <a:graphicFrameLocks xmlns:a="http://schemas.openxmlformats.org/drawingml/2006/main" noChangeAspect="1"/>
+            </wp:cNvGraphicFramePr>
+            <a:graphic xmlns:a="http://schemas.openxmlformats.org/drawingml/2006/main">
+              <a:graphicData uri="http://schemas.openxmlformats.org/drawingml/2006/picture">
+                <pic:pic xmlns:pic="http://schemas.openxmlformats.org/drawingml/2006/picture">
+                  <pic:nvPicPr>
+                    <pic:cNvPr id="0" name="Picture 5" descr="Signs of Ransomware detected, no progress further possible - Microsoft Q&amp;A"/>
+                    <pic:cNvPicPr>
+                      <a:picLocks noChangeAspect="1" noChangeArrowheads="1"/>
+                    </pic:cNvPicPr>
+                  </pic:nvPicPr>
+                  <pic:blipFill>
+                    <a:blip r:embed="rId22" cstate="print">
+                      <a:extLst>
+                        <a:ext uri="{28A0092B-C50C-407E-A947-70E740481C1C}">
+                          <a14:useLocalDpi xmlns:a14="http://schemas.microsoft.com/office/drawing/2010/main" val="0"/>
+                        </a:ext>
+                      </a:extLst>
+                    </a:blip>
+                    <a:srcRect/>
+                    <a:stretch>
+                      <a:fillRect/>
+                    </a:stretch>
+                  </pic:blipFill>
+                  <pic:spPr bwMode="auto">
+                    <a:xfrm>
+                      <a:off x="0" y="0"/>
+                      <a:ext cx="5107234" cy="3450866"/>
+                    </a:xfrm>
+                    <a:prstGeom prst="rect">
+                      <a:avLst/>
+                    </a:prstGeom>
+                    <a:noFill/>
+                    <a:ln>
+                      <a:noFill/>
+                    </a:ln>
+                  </pic:spPr>
+                </pic:pic>
+              </a:graphicData>
+            </a:graphic>
+          </wp:anchor>
+        </w:drawing>
+      </w:r>
+      <w:r>
+        <w:rPr>
+          <w:rFonts w:ascii="Poppins" w:hAnsi="Poppins" w:cs="Poppins"/>
+          <w:b/>
+          <w:bCs/>
+          <w:color w:val="000000" w:themeColor="text1"/>
+        </w:rPr>
+        <w:t xml:space="preserve">4. Protección contra </w:t>
+      </w:r>
+      <w:proofErr w:type="spellStart"/>
+      <w:r>
+        <w:rPr>
+          <w:rFonts w:ascii="Poppins" w:hAnsi="Poppins" w:cs="Poppins"/>
+          <w:b/>
+          <w:bCs/>
+          <w:color w:val="000000" w:themeColor="text1"/>
+        </w:rPr>
+        <w:t>Ransomware</w:t>
+      </w:r>
+      <w:proofErr w:type="spellEnd"/>
+      <w:r>
+        <w:rPr>
+          <w:rFonts w:ascii="Poppins" w:hAnsi="Poppins" w:cs="Poppins"/>
+          <w:b/>
+          <w:bCs/>
+          <w:color w:val="000000" w:themeColor="text1"/>
+        </w:rPr>
+        <w:t xml:space="preserve"> y Copias de Seguridad</w:t>
+      </w:r>
+      <w:r>
+        <w:rPr>
+          <w:rFonts w:ascii="Poppins" w:hAnsi="Poppins" w:cs="Poppins"/>
+          <w:b/>
+          <w:bCs/>
+          <w:color w:val="000000" w:themeColor="text1"/>
+        </w:rPr>
+        <w:t>:</w:t>
+      </w:r>
+      <w:r>
+        <w:rPr>
+          <w:rFonts w:ascii="Poppins" w:hAnsi="Poppins" w:cs="Poppins"/>
+          <w:color w:val="000000" w:themeColor="text1"/>
+        </w:rPr>
+        <w:t xml:space="preserve"> El plan incluye "Restauración de archivos". Si un virus encripta los ordenadores de la clínica, OneDrive permite "rebobinar" la cuenta a un punto anterior (hasta 30 días atrás) y recuperar los archivos sanos en minutos.</w:t>
+      </w:r>
+    </w:p>
+    <w:p>
+      <w:pPr>
+        <w:tabs>
+          <w:tab w:val="left" w:pos="7284"/>
+        </w:tabs>
+        <w:jc w:val="center"/>
+        <w:rPr>
+          <w:rFonts w:ascii="Poppins" w:hAnsi="Poppins" w:cs="Poppins"/>
+          <w:b/>
+          <w:bCs/>
+          <w:i/>
+          <w:iCs/>
+          <w:color w:val="000000" w:themeColor="text1"/>
+        </w:rPr>
+      </w:pPr>
+      <w:r>
+        <w:rPr>
+          <w:noProof/>
+        </w:rPr>
+        <w:drawing>
+          <wp:anchor distT="0" distB="0" distL="114300" distR="114300" simplePos="0" relativeHeight="251660288" behindDoc="1" locked="0" layoutInCell="1" allowOverlap="1" wp14:anchorId="40FB7BD9" wp14:editId="69416E78">
+            <wp:simplePos x="0" y="0"/>
+            <wp:positionH relativeFrom="margin">
+              <wp:align>center</wp:align>
+            </wp:positionH>
+            <wp:positionV relativeFrom="paragraph">
+              <wp:posOffset>3979048</wp:posOffset>
+            </wp:positionV>
+            <wp:extent cx="4874150" cy="2987881"/>
+            <wp:effectExtent l="0" t="0" r="3175" b="3175"/>
+            <wp:wrapTight wrapText="bothSides">
+              <wp:wrapPolygon edited="0">
+                <wp:start x="0" y="0"/>
+                <wp:lineTo x="0" y="21485"/>
+                <wp:lineTo x="21530" y="21485"/>
+                <wp:lineTo x="21530" y="0"/>
+                <wp:lineTo x="0" y="0"/>
+              </wp:wrapPolygon>
+            </wp:wrapTight>
+            <wp:docPr id="18" name="Imagen 18" descr="Getting Started with Microsoft #Azure Cloud #Security Center | Cloud and  Datacenter Management Blog"/>
+            <wp:cNvGraphicFramePr>
+              <a:graphicFrameLocks xmlns:a="http://schemas.openxmlformats.org/drawingml/2006/main" noChangeAspect="1"/>
+            </wp:cNvGraphicFramePr>
+            <a:graphic xmlns:a="http://schemas.openxmlformats.org/drawingml/2006/main">
+              <a:graphicData uri="http://schemas.openxmlformats.org/drawingml/2006/picture">
+                <pic:pic xmlns:pic="http://schemas.openxmlformats.org/drawingml/2006/picture">
+                  <pic:nvPicPr>
+                    <pic:cNvPr id="0" name="Picture 7" descr="Getting Started with Microsoft #Azure Cloud #Security Center | Cloud and  Datacenter Management Blog"/>
+                    <pic:cNvPicPr>
+                      <a:picLocks noChangeAspect="1" noChangeArrowheads="1"/>
+                    </pic:cNvPicPr>
+                  </pic:nvPicPr>
+                  <pic:blipFill>
+                    <a:blip r:embed="rId23">
+                      <a:extLst>
+                        <a:ext uri="{28A0092B-C50C-407E-A947-70E740481C1C}">
+                          <a14:useLocalDpi xmlns:a14="http://schemas.microsoft.com/office/drawing/2010/main" val="0"/>
+                        </a:ext>
+                      </a:extLst>
+                    </a:blip>
+                    <a:srcRect/>
+                    <a:stretch>
+                      <a:fillRect/>
+                    </a:stretch>
+                  </pic:blipFill>
+                  <pic:spPr bwMode="auto">
+                    <a:xfrm>
+                      <a:off x="0" y="0"/>
+                      <a:ext cx="4874150" cy="2987881"/>
+                    </a:xfrm>
+                    <a:prstGeom prst="rect">
+                      <a:avLst/>
+                    </a:prstGeom>
+                    <a:noFill/>
+                    <a:ln>
+                      <a:noFill/>
+                    </a:ln>
+                  </pic:spPr>
+                </pic:pic>
+              </a:graphicData>
+            </a:graphic>
+          </wp:anchor>
+        </w:drawing>
+      </w:r>
+      <w:proofErr w:type="spellStart"/>
+      <w:r>
+        <w:rPr>
+          <w:rFonts w:ascii="Poppins" w:hAnsi="Poppins" w:cs="Poppins"/>
+          <w:b/>
+          <w:bCs/>
+          <w:i/>
+          <w:iCs/>
+          <w:color w:val="000000" w:themeColor="text1"/>
+        </w:rPr>
+        <w:t>Fig</w:t>
+      </w:r>
+      <w:proofErr w:type="spellEnd"/>
+      <w:r>
+        <w:rPr>
+          <w:rFonts w:ascii="Poppins" w:hAnsi="Poppins" w:cs="Poppins"/>
+          <w:b/>
+          <w:bCs/>
+          <w:i/>
+          <w:iCs/>
+          <w:color w:val="000000" w:themeColor="text1"/>
+        </w:rPr>
+        <w:t xml:space="preserve"> 1. Sistema de recuperación ante ataques</w:t>
+      </w:r>
+    </w:p>
+    <w:p>
+      <w:pPr>
+        <w:tabs>
+          <w:tab w:val="left" w:pos="7284"/>
+        </w:tabs>
+        <w:jc w:val="center"/>
         <w:rPr>
           <w:rFonts w:ascii="Poppins" w:hAnsi="Poppins" w:cs="Poppins"/>
           <w:sz w:val="36"/>
           <w:szCs w:val="36"/>
         </w:rPr>
-        <w:tab/>
-      </w:r>
-    </w:p>
-    <w:p>
-      <w:pPr>
-        <w:tabs>
-          <w:tab w:val="left" w:pos="7284"/>
-        </w:tabs>
-        <w:rPr>
-          <w:rFonts w:ascii="Poppins" w:hAnsi="Poppins" w:cs="Poppins"/>
-          <w:sz w:val="36"/>
-          <w:szCs w:val="36"/>
-        </w:rPr>
-      </w:pPr>
-    </w:p>
-    <w:p>
-      <w:pPr>
-        <w:tabs>
-          <w:tab w:val="left" w:pos="7284"/>
-        </w:tabs>
-        <w:rPr>
-          <w:rFonts w:ascii="Poppins" w:hAnsi="Poppins" w:cs="Poppins"/>
-          <w:sz w:val="36"/>
-          <w:szCs w:val="36"/>
-        </w:rPr>
-      </w:pPr>
-    </w:p>
-    <w:p>
-      <w:pPr>
-        <w:tabs>
-          <w:tab w:val="left" w:pos="7284"/>
-        </w:tabs>
-        <w:rPr>
-          <w:rFonts w:ascii="Poppins" w:hAnsi="Poppins" w:cs="Poppins"/>
-          <w:sz w:val="36"/>
-          <w:szCs w:val="36"/>
-        </w:rPr>
-      </w:pPr>
-    </w:p>
-    <w:p>
-      <w:pPr>
-        <w:tabs>
-          <w:tab w:val="left" w:pos="7284"/>
-        </w:tabs>
-        <w:rPr>
-          <w:rFonts w:ascii="Poppins" w:hAnsi="Poppins" w:cs="Poppins"/>
-          <w:sz w:val="36"/>
-          <w:szCs w:val="36"/>
-        </w:rPr>
-      </w:pPr>
-    </w:p>
-    <w:p>
-      <w:pPr>
-        <w:tabs>
-          <w:tab w:val="left" w:pos="7284"/>
-        </w:tabs>
-        <w:rPr>
-          <w:rFonts w:ascii="Poppins" w:hAnsi="Poppins" w:cs="Poppins"/>
-          <w:sz w:val="36"/>
-          <w:szCs w:val="36"/>
-        </w:rPr>
-      </w:pPr>
-    </w:p>
-    <w:p>
-      <w:pPr>
-        <w:tabs>
-          <w:tab w:val="left" w:pos="7284"/>
-        </w:tabs>
-        <w:rPr>
-          <w:rFonts w:ascii="Poppins" w:hAnsi="Poppins" w:cs="Poppins"/>
-          <w:sz w:val="36"/>
-          <w:szCs w:val="36"/>
-        </w:rPr>
-      </w:pPr>
-    </w:p>
-    <w:p>
-      <w:pPr>
-        <w:tabs>
-          <w:tab w:val="left" w:pos="7284"/>
-        </w:tabs>
-        <w:rPr>
-          <w:rFonts w:ascii="Poppins" w:hAnsi="Poppins" w:cs="Poppins"/>
-          <w:sz w:val="36"/>
-          <w:szCs w:val="36"/>
-        </w:rPr>
-      </w:pPr>
-    </w:p>
-    <w:p>
-      <w:pPr>
-        <w:tabs>
-          <w:tab w:val="left" w:pos="7284"/>
-        </w:tabs>
-        <w:rPr>
-          <w:rFonts w:ascii="Poppins" w:hAnsi="Poppins" w:cs="Poppins"/>
-          <w:sz w:val="36"/>
-          <w:szCs w:val="36"/>
-        </w:rPr>
-      </w:pPr>
-    </w:p>
-    <w:p>
-      <w:pPr>
-        <w:tabs>
-          <w:tab w:val="left" w:pos="7284"/>
-        </w:tabs>
-        <w:rPr>
-          <w:rFonts w:ascii="Poppins" w:hAnsi="Poppins" w:cs="Poppins"/>
-          <w:sz w:val="36"/>
-          <w:szCs w:val="36"/>
-        </w:rPr>
-      </w:pPr>
-    </w:p>
-    <w:p>
-      <w:pPr>
-        <w:tabs>
-          <w:tab w:val="left" w:pos="7284"/>
-        </w:tabs>
-        <w:rPr>
-          <w:rFonts w:ascii="Poppins" w:hAnsi="Poppins" w:cs="Poppins"/>
-          <w:sz w:val="36"/>
-          <w:szCs w:val="36"/>
-        </w:rPr>
-      </w:pPr>
-    </w:p>
-    <w:p>
-      <w:pPr>
-        <w:tabs>
-          <w:tab w:val="left" w:pos="7284"/>
-        </w:tabs>
-        <w:rPr>
-          <w:rFonts w:ascii="Poppins" w:hAnsi="Poppins" w:cs="Poppins"/>
-          <w:sz w:val="36"/>
-          <w:szCs w:val="36"/>
-        </w:rPr>
-      </w:pPr>
+      </w:pPr>
+      <w:proofErr w:type="spellStart"/>
+      <w:r>
+        <w:rPr>
+          <w:rFonts w:ascii="Poppins" w:hAnsi="Poppins" w:cs="Poppins"/>
+          <w:b/>
+          <w:bCs/>
+          <w:i/>
+          <w:iCs/>
+        </w:rPr>
+        <w:t>Fig</w:t>
+      </w:r>
+      <w:proofErr w:type="spellEnd"/>
+      <w:r>
+        <w:rPr>
+          <w:rFonts w:ascii="Poppins" w:hAnsi="Poppins" w:cs="Poppins"/>
+          <w:b/>
+          <w:bCs/>
+          <w:i/>
+          <w:iCs/>
+        </w:rPr>
+        <w:t xml:space="preserve"> 2. Certificaciones de cumplimiento normativ</w:t>
+      </w:r>
+      <w:r>
+        <w:rPr>
+          <w:rFonts w:ascii="Poppins" w:hAnsi="Poppins" w:cs="Poppins"/>
+          <w:b/>
+          <w:bCs/>
+          <w:i/>
+          <w:iCs/>
+        </w:rPr>
+        <w:t>o</w:t>
+      </w:r>
     </w:p>
     <w:sectPr>
-      <w:headerReference w:type="default" r:id="rId21"/>
-      <w:footerReference w:type="default" r:id="rId22"/>
+      <w:headerReference w:type="default" r:id="rId24"/>
+      <w:footerReference w:type="default" r:id="rId25"/>
       <w:pgSz w:w="11906" w:h="16838"/>
       <w:pgMar w:top="1417" w:right="1701" w:bottom="1417" w:left="1701" w:header="708" w:footer="708" w:gutter="0"/>
       <w:cols w:space="708"/>
@@ -1978,9 +3373,695 @@
 <file path=word/numbering.xml><?xml version="1.0" encoding="utf-8"?>
 <w:numbering xmlns:wpc="http://schemas.microsoft.com/office/word/2010/wordprocessingCanvas" xmlns:cx="http://schemas.microsoft.com/office/drawing/2014/chartex" xmlns:cx1="http://schemas.microsoft.com/office/drawing/2015/9/8/chartex" xmlns:cx2="http://schemas.microsoft.com/office/drawing/2015/10/21/chartex" xmlns:cx3="http://schemas.microsoft.com/office/drawing/2016/5/9/chartex" xmlns:cx4="http://schemas.microsoft.com/office/drawing/2016/5/10/chartex" xmlns:cx5="http://schemas.microsoft.com/office/drawing/2016/5/11/chartex" xmlns:cx6="http://schemas.microsoft.com/office/drawing/2016/5/12/chartex" xmlns:cx7="http://schemas.microsoft.com/office/drawing/2016/5/13/chartex" xmlns:cx8="http://schemas.microsoft.com/office/drawing/2016/5/14/chartex" xmlns:mc="http://schemas.openxmlformats.org/markup-compatibility/2006" xmlns:aink="http://schemas.microsoft.com/office/drawing/2016/ink" xmlns:am3d="http://schemas.microsoft.com/office/drawing/2017/model3d" xmlns:o="urn:schemas-microsoft-com:office:office" xmlns:oel="http://schemas.microsoft.com/office/2019/extlst" xmlns:r="http://schemas.openxmlformats.org/officeDocument/2006/relationships" xmlns:m="http://schemas.openxmlformats.org/officeDocument/2006/math" xmlns:v="urn:schemas-microsoft-com:vml" xmlns:wp14="http://schemas.microsoft.com/office/word/2010/wordprocessingDrawing" xmlns:wp="http://schemas.openxmlformats.org/drawingml/2006/wordprocessingDrawing" xmlns:w10="urn:schemas-microsoft-com:office:word" xmlns:w="http://schemas.openxmlformats.org/wordprocessingml/2006/main" xmlns:w14="http://schemas.microsoft.com/office/word/2010/wordml" xmlns:w15="http://schemas.microsoft.com/office/word/2012/wordml" xmlns:w16cex="http://schemas.microsoft.com/office/word/2018/wordml/cex" xmlns:w16cid="http://schemas.microsoft.com/office/word/2016/wordml/cid" xmlns:w16="http://schemas.microsoft.com/office/word/2018/wordml" xmlns:w16sdtdh="http://schemas.microsoft.com/office/word/2020/wordml/sdtdatahash" xmlns:w16se="http://schemas.microsoft.com/office/word/2015/wordml/symex" xmlns:wpg="http://schemas.microsoft.com/office/word/2010/wordprocessingGroup" xmlns:wpi="http://schemas.microsoft.com/office/word/2010/wordprocessingInk" xmlns:wne="http://schemas.microsoft.com/office/word/2006/wordml" xmlns:wps="http://schemas.microsoft.com/office/word/2010/wordprocessingShape" mc:Ignorable="w14 w15 w16se w16cid w16 w16cex w16sdtdh wp14">
   <w:abstractNum w:abstractNumId="0" w15:restartNumberingAfterBreak="0">
+    <w:nsid w:val="071B3F56"/>
+    <w:multiLevelType w:val="multilevel"/>
+    <w:tmpl w:val="7FB0E332"/>
+    <w:lvl w:ilvl="0">
+      <w:start w:val="1"/>
+      <w:numFmt w:val="bullet"/>
+      <w:lvlText w:val=""/>
+      <w:lvlJc w:val="left"/>
+      <w:pPr>
+        <w:tabs>
+          <w:tab w:val="num" w:pos="720"/>
+        </w:tabs>
+        <w:ind w:left="720" w:hanging="360"/>
+      </w:pPr>
+      <w:rPr>
+        <w:rFonts w:ascii="Symbol" w:hAnsi="Symbol" w:hint="default"/>
+        <w:color w:val="000000" w:themeColor="text1"/>
+        <w:sz w:val="20"/>
+      </w:rPr>
+    </w:lvl>
+    <w:lvl w:ilvl="1" w:tentative="1">
+      <w:start w:val="1"/>
+      <w:numFmt w:val="bullet"/>
+      <w:lvlText w:val="o"/>
+      <w:lvlJc w:val="left"/>
+      <w:pPr>
+        <w:tabs>
+          <w:tab w:val="num" w:pos="1440"/>
+        </w:tabs>
+        <w:ind w:left="1440" w:hanging="360"/>
+      </w:pPr>
+      <w:rPr>
+        <w:rFonts w:ascii="Courier New" w:hAnsi="Courier New" w:hint="default"/>
+        <w:sz w:val="20"/>
+      </w:rPr>
+    </w:lvl>
+    <w:lvl w:ilvl="2" w:tentative="1">
+      <w:start w:val="1"/>
+      <w:numFmt w:val="bullet"/>
+      <w:lvlText w:val=""/>
+      <w:lvlJc w:val="left"/>
+      <w:pPr>
+        <w:tabs>
+          <w:tab w:val="num" w:pos="2160"/>
+        </w:tabs>
+        <w:ind w:left="2160" w:hanging="360"/>
+      </w:pPr>
+      <w:rPr>
+        <w:rFonts w:ascii="Wingdings" w:hAnsi="Wingdings" w:hint="default"/>
+        <w:sz w:val="20"/>
+      </w:rPr>
+    </w:lvl>
+    <w:lvl w:ilvl="3" w:tentative="1">
+      <w:start w:val="1"/>
+      <w:numFmt w:val="bullet"/>
+      <w:lvlText w:val=""/>
+      <w:lvlJc w:val="left"/>
+      <w:pPr>
+        <w:tabs>
+          <w:tab w:val="num" w:pos="2880"/>
+        </w:tabs>
+        <w:ind w:left="2880" w:hanging="360"/>
+      </w:pPr>
+      <w:rPr>
+        <w:rFonts w:ascii="Wingdings" w:hAnsi="Wingdings" w:hint="default"/>
+        <w:sz w:val="20"/>
+      </w:rPr>
+    </w:lvl>
+    <w:lvl w:ilvl="4" w:tentative="1">
+      <w:start w:val="1"/>
+      <w:numFmt w:val="bullet"/>
+      <w:lvlText w:val=""/>
+      <w:lvlJc w:val="left"/>
+      <w:pPr>
+        <w:tabs>
+          <w:tab w:val="num" w:pos="3600"/>
+        </w:tabs>
+        <w:ind w:left="3600" w:hanging="360"/>
+      </w:pPr>
+      <w:rPr>
+        <w:rFonts w:ascii="Wingdings" w:hAnsi="Wingdings" w:hint="default"/>
+        <w:sz w:val="20"/>
+      </w:rPr>
+    </w:lvl>
+    <w:lvl w:ilvl="5" w:tentative="1">
+      <w:start w:val="1"/>
+      <w:numFmt w:val="bullet"/>
+      <w:lvlText w:val=""/>
+      <w:lvlJc w:val="left"/>
+      <w:pPr>
+        <w:tabs>
+          <w:tab w:val="num" w:pos="4320"/>
+        </w:tabs>
+        <w:ind w:left="4320" w:hanging="360"/>
+      </w:pPr>
+      <w:rPr>
+        <w:rFonts w:ascii="Wingdings" w:hAnsi="Wingdings" w:hint="default"/>
+        <w:sz w:val="20"/>
+      </w:rPr>
+    </w:lvl>
+    <w:lvl w:ilvl="6" w:tentative="1">
+      <w:start w:val="1"/>
+      <w:numFmt w:val="bullet"/>
+      <w:lvlText w:val=""/>
+      <w:lvlJc w:val="left"/>
+      <w:pPr>
+        <w:tabs>
+          <w:tab w:val="num" w:pos="5040"/>
+        </w:tabs>
+        <w:ind w:left="5040" w:hanging="360"/>
+      </w:pPr>
+      <w:rPr>
+        <w:rFonts w:ascii="Wingdings" w:hAnsi="Wingdings" w:hint="default"/>
+        <w:sz w:val="20"/>
+      </w:rPr>
+    </w:lvl>
+    <w:lvl w:ilvl="7" w:tentative="1">
+      <w:start w:val="1"/>
+      <w:numFmt w:val="bullet"/>
+      <w:lvlText w:val=""/>
+      <w:lvlJc w:val="left"/>
+      <w:pPr>
+        <w:tabs>
+          <w:tab w:val="num" w:pos="5760"/>
+        </w:tabs>
+        <w:ind w:left="5760" w:hanging="360"/>
+      </w:pPr>
+      <w:rPr>
+        <w:rFonts w:ascii="Wingdings" w:hAnsi="Wingdings" w:hint="default"/>
+        <w:sz w:val="20"/>
+      </w:rPr>
+    </w:lvl>
+    <w:lvl w:ilvl="8" w:tentative="1">
+      <w:start w:val="1"/>
+      <w:numFmt w:val="bullet"/>
+      <w:lvlText w:val=""/>
+      <w:lvlJc w:val="left"/>
+      <w:pPr>
+        <w:tabs>
+          <w:tab w:val="num" w:pos="6480"/>
+        </w:tabs>
+        <w:ind w:left="6480" w:hanging="360"/>
+      </w:pPr>
+      <w:rPr>
+        <w:rFonts w:ascii="Wingdings" w:hAnsi="Wingdings" w:hint="default"/>
+        <w:sz w:val="20"/>
+      </w:rPr>
+    </w:lvl>
+  </w:abstractNum>
+  <w:abstractNum w:abstractNumId="1" w15:restartNumberingAfterBreak="0">
+    <w:nsid w:val="0AED6A2E"/>
+    <w:multiLevelType w:val="hybridMultilevel"/>
+    <w:tmpl w:val="B7DCF8E8"/>
+    <w:lvl w:ilvl="0" w:tplc="0C0A000F">
+      <w:start w:val="1"/>
+      <w:numFmt w:val="decimal"/>
+      <w:lvlText w:val="%1."/>
+      <w:lvlJc w:val="left"/>
+      <w:pPr>
+        <w:ind w:left="720" w:hanging="360"/>
+      </w:pPr>
+      <w:rPr>
+        <w:rFonts w:hint="default"/>
+      </w:rPr>
+    </w:lvl>
+    <w:lvl w:ilvl="1" w:tplc="0C0A0019" w:tentative="1">
+      <w:start w:val="1"/>
+      <w:numFmt w:val="lowerLetter"/>
+      <w:lvlText w:val="%2."/>
+      <w:lvlJc w:val="left"/>
+      <w:pPr>
+        <w:ind w:left="1440" w:hanging="360"/>
+      </w:pPr>
+    </w:lvl>
+    <w:lvl w:ilvl="2" w:tplc="0C0A001B" w:tentative="1">
+      <w:start w:val="1"/>
+      <w:numFmt w:val="lowerRoman"/>
+      <w:lvlText w:val="%3."/>
+      <w:lvlJc w:val="right"/>
+      <w:pPr>
+        <w:ind w:left="2160" w:hanging="180"/>
+      </w:pPr>
+    </w:lvl>
+    <w:lvl w:ilvl="3" w:tplc="0C0A000F" w:tentative="1">
+      <w:start w:val="1"/>
+      <w:numFmt w:val="decimal"/>
+      <w:lvlText w:val="%4."/>
+      <w:lvlJc w:val="left"/>
+      <w:pPr>
+        <w:ind w:left="2880" w:hanging="360"/>
+      </w:pPr>
+    </w:lvl>
+    <w:lvl w:ilvl="4" w:tplc="0C0A0019" w:tentative="1">
+      <w:start w:val="1"/>
+      <w:numFmt w:val="lowerLetter"/>
+      <w:lvlText w:val="%5."/>
+      <w:lvlJc w:val="left"/>
+      <w:pPr>
+        <w:ind w:left="3600" w:hanging="360"/>
+      </w:pPr>
+    </w:lvl>
+    <w:lvl w:ilvl="5" w:tplc="0C0A001B" w:tentative="1">
+      <w:start w:val="1"/>
+      <w:numFmt w:val="lowerRoman"/>
+      <w:lvlText w:val="%6."/>
+      <w:lvlJc w:val="right"/>
+      <w:pPr>
+        <w:ind w:left="4320" w:hanging="180"/>
+      </w:pPr>
+    </w:lvl>
+    <w:lvl w:ilvl="6" w:tplc="0C0A000F" w:tentative="1">
+      <w:start w:val="1"/>
+      <w:numFmt w:val="decimal"/>
+      <w:lvlText w:val="%7."/>
+      <w:lvlJc w:val="left"/>
+      <w:pPr>
+        <w:ind w:left="5040" w:hanging="360"/>
+      </w:pPr>
+    </w:lvl>
+    <w:lvl w:ilvl="7" w:tplc="0C0A0019" w:tentative="1">
+      <w:start w:val="1"/>
+      <w:numFmt w:val="lowerLetter"/>
+      <w:lvlText w:val="%8."/>
+      <w:lvlJc w:val="left"/>
+      <w:pPr>
+        <w:ind w:left="5760" w:hanging="360"/>
+      </w:pPr>
+    </w:lvl>
+    <w:lvl w:ilvl="8" w:tplc="0C0A001B" w:tentative="1">
+      <w:start w:val="1"/>
+      <w:numFmt w:val="lowerRoman"/>
+      <w:lvlText w:val="%9."/>
+      <w:lvlJc w:val="right"/>
+      <w:pPr>
+        <w:ind w:left="6480" w:hanging="180"/>
+      </w:pPr>
+    </w:lvl>
+  </w:abstractNum>
+  <w:abstractNum w:abstractNumId="2" w15:restartNumberingAfterBreak="0">
+    <w:nsid w:val="15CF5471"/>
+    <w:multiLevelType w:val="multilevel"/>
+    <w:tmpl w:val="6066C01A"/>
+    <w:lvl w:ilvl="0">
+      <w:start w:val="1"/>
+      <w:numFmt w:val="bullet"/>
+      <w:lvlText w:val=""/>
+      <w:lvlJc w:val="left"/>
+      <w:pPr>
+        <w:tabs>
+          <w:tab w:val="num" w:pos="1068"/>
+        </w:tabs>
+        <w:ind w:left="1068" w:hanging="360"/>
+      </w:pPr>
+      <w:rPr>
+        <w:rFonts w:ascii="Symbol" w:hAnsi="Symbol" w:hint="default"/>
+        <w:sz w:val="20"/>
+      </w:rPr>
+    </w:lvl>
+    <w:lvl w:ilvl="1" w:tentative="1">
+      <w:start w:val="1"/>
+      <w:numFmt w:val="bullet"/>
+      <w:lvlText w:val="o"/>
+      <w:lvlJc w:val="left"/>
+      <w:pPr>
+        <w:tabs>
+          <w:tab w:val="num" w:pos="1788"/>
+        </w:tabs>
+        <w:ind w:left="1788" w:hanging="360"/>
+      </w:pPr>
+      <w:rPr>
+        <w:rFonts w:ascii="Courier New" w:hAnsi="Courier New" w:hint="default"/>
+        <w:sz w:val="20"/>
+      </w:rPr>
+    </w:lvl>
+    <w:lvl w:ilvl="2" w:tentative="1">
+      <w:start w:val="1"/>
+      <w:numFmt w:val="bullet"/>
+      <w:lvlText w:val=""/>
+      <w:lvlJc w:val="left"/>
+      <w:pPr>
+        <w:tabs>
+          <w:tab w:val="num" w:pos="2508"/>
+        </w:tabs>
+        <w:ind w:left="2508" w:hanging="360"/>
+      </w:pPr>
+      <w:rPr>
+        <w:rFonts w:ascii="Wingdings" w:hAnsi="Wingdings" w:hint="default"/>
+        <w:sz w:val="20"/>
+      </w:rPr>
+    </w:lvl>
+    <w:lvl w:ilvl="3" w:tentative="1">
+      <w:start w:val="1"/>
+      <w:numFmt w:val="bullet"/>
+      <w:lvlText w:val=""/>
+      <w:lvlJc w:val="left"/>
+      <w:pPr>
+        <w:tabs>
+          <w:tab w:val="num" w:pos="3228"/>
+        </w:tabs>
+        <w:ind w:left="3228" w:hanging="360"/>
+      </w:pPr>
+      <w:rPr>
+        <w:rFonts w:ascii="Wingdings" w:hAnsi="Wingdings" w:hint="default"/>
+        <w:sz w:val="20"/>
+      </w:rPr>
+    </w:lvl>
+    <w:lvl w:ilvl="4" w:tentative="1">
+      <w:start w:val="1"/>
+      <w:numFmt w:val="bullet"/>
+      <w:lvlText w:val=""/>
+      <w:lvlJc w:val="left"/>
+      <w:pPr>
+        <w:tabs>
+          <w:tab w:val="num" w:pos="3948"/>
+        </w:tabs>
+        <w:ind w:left="3948" w:hanging="360"/>
+      </w:pPr>
+      <w:rPr>
+        <w:rFonts w:ascii="Wingdings" w:hAnsi="Wingdings" w:hint="default"/>
+        <w:sz w:val="20"/>
+      </w:rPr>
+    </w:lvl>
+    <w:lvl w:ilvl="5" w:tentative="1">
+      <w:start w:val="1"/>
+      <w:numFmt w:val="bullet"/>
+      <w:lvlText w:val=""/>
+      <w:lvlJc w:val="left"/>
+      <w:pPr>
+        <w:tabs>
+          <w:tab w:val="num" w:pos="4668"/>
+        </w:tabs>
+        <w:ind w:left="4668" w:hanging="360"/>
+      </w:pPr>
+      <w:rPr>
+        <w:rFonts w:ascii="Wingdings" w:hAnsi="Wingdings" w:hint="default"/>
+        <w:sz w:val="20"/>
+      </w:rPr>
+    </w:lvl>
+    <w:lvl w:ilvl="6" w:tentative="1">
+      <w:start w:val="1"/>
+      <w:numFmt w:val="bullet"/>
+      <w:lvlText w:val=""/>
+      <w:lvlJc w:val="left"/>
+      <w:pPr>
+        <w:tabs>
+          <w:tab w:val="num" w:pos="5388"/>
+        </w:tabs>
+        <w:ind w:left="5388" w:hanging="360"/>
+      </w:pPr>
+      <w:rPr>
+        <w:rFonts w:ascii="Wingdings" w:hAnsi="Wingdings" w:hint="default"/>
+        <w:sz w:val="20"/>
+      </w:rPr>
+    </w:lvl>
+    <w:lvl w:ilvl="7" w:tentative="1">
+      <w:start w:val="1"/>
+      <w:numFmt w:val="bullet"/>
+      <w:lvlText w:val=""/>
+      <w:lvlJc w:val="left"/>
+      <w:pPr>
+        <w:tabs>
+          <w:tab w:val="num" w:pos="6108"/>
+        </w:tabs>
+        <w:ind w:left="6108" w:hanging="360"/>
+      </w:pPr>
+      <w:rPr>
+        <w:rFonts w:ascii="Wingdings" w:hAnsi="Wingdings" w:hint="default"/>
+        <w:sz w:val="20"/>
+      </w:rPr>
+    </w:lvl>
+    <w:lvl w:ilvl="8" w:tentative="1">
+      <w:start w:val="1"/>
+      <w:numFmt w:val="bullet"/>
+      <w:lvlText w:val=""/>
+      <w:lvlJc w:val="left"/>
+      <w:pPr>
+        <w:tabs>
+          <w:tab w:val="num" w:pos="6828"/>
+        </w:tabs>
+        <w:ind w:left="6828" w:hanging="360"/>
+      </w:pPr>
+      <w:rPr>
+        <w:rFonts w:ascii="Wingdings" w:hAnsi="Wingdings" w:hint="default"/>
+        <w:sz w:val="20"/>
+      </w:rPr>
+    </w:lvl>
+  </w:abstractNum>
+  <w:abstractNum w:abstractNumId="3" w15:restartNumberingAfterBreak="0">
+    <w:nsid w:val="1CB17712"/>
+    <w:multiLevelType w:val="multilevel"/>
+    <w:tmpl w:val="77B6F4B0"/>
+    <w:lvl w:ilvl="0">
+      <w:start w:val="1"/>
+      <w:numFmt w:val="bullet"/>
+      <w:lvlText w:val=""/>
+      <w:lvlJc w:val="left"/>
+      <w:pPr>
+        <w:tabs>
+          <w:tab w:val="num" w:pos="1068"/>
+        </w:tabs>
+        <w:ind w:left="1068" w:hanging="360"/>
+      </w:pPr>
+      <w:rPr>
+        <w:rFonts w:ascii="Symbol" w:hAnsi="Symbol" w:hint="default"/>
+        <w:sz w:val="20"/>
+      </w:rPr>
+    </w:lvl>
+    <w:lvl w:ilvl="1" w:tentative="1">
+      <w:start w:val="1"/>
+      <w:numFmt w:val="bullet"/>
+      <w:lvlText w:val="o"/>
+      <w:lvlJc w:val="left"/>
+      <w:pPr>
+        <w:tabs>
+          <w:tab w:val="num" w:pos="1788"/>
+        </w:tabs>
+        <w:ind w:left="1788" w:hanging="360"/>
+      </w:pPr>
+      <w:rPr>
+        <w:rFonts w:ascii="Courier New" w:hAnsi="Courier New" w:hint="default"/>
+        <w:sz w:val="20"/>
+      </w:rPr>
+    </w:lvl>
+    <w:lvl w:ilvl="2" w:tentative="1">
+      <w:start w:val="1"/>
+      <w:numFmt w:val="bullet"/>
+      <w:lvlText w:val=""/>
+      <w:lvlJc w:val="left"/>
+      <w:pPr>
+        <w:tabs>
+          <w:tab w:val="num" w:pos="2508"/>
+        </w:tabs>
+        <w:ind w:left="2508" w:hanging="360"/>
+      </w:pPr>
+      <w:rPr>
+        <w:rFonts w:ascii="Wingdings" w:hAnsi="Wingdings" w:hint="default"/>
+        <w:sz w:val="20"/>
+      </w:rPr>
+    </w:lvl>
+    <w:lvl w:ilvl="3" w:tentative="1">
+      <w:start w:val="1"/>
+      <w:numFmt w:val="bullet"/>
+      <w:lvlText w:val=""/>
+      <w:lvlJc w:val="left"/>
+      <w:pPr>
+        <w:tabs>
+          <w:tab w:val="num" w:pos="3228"/>
+        </w:tabs>
+        <w:ind w:left="3228" w:hanging="360"/>
+      </w:pPr>
+      <w:rPr>
+        <w:rFonts w:ascii="Wingdings" w:hAnsi="Wingdings" w:hint="default"/>
+        <w:sz w:val="20"/>
+      </w:rPr>
+    </w:lvl>
+    <w:lvl w:ilvl="4" w:tentative="1">
+      <w:start w:val="1"/>
+      <w:numFmt w:val="bullet"/>
+      <w:lvlText w:val=""/>
+      <w:lvlJc w:val="left"/>
+      <w:pPr>
+        <w:tabs>
+          <w:tab w:val="num" w:pos="3948"/>
+        </w:tabs>
+        <w:ind w:left="3948" w:hanging="360"/>
+      </w:pPr>
+      <w:rPr>
+        <w:rFonts w:ascii="Wingdings" w:hAnsi="Wingdings" w:hint="default"/>
+        <w:sz w:val="20"/>
+      </w:rPr>
+    </w:lvl>
+    <w:lvl w:ilvl="5" w:tentative="1">
+      <w:start w:val="1"/>
+      <w:numFmt w:val="bullet"/>
+      <w:lvlText w:val=""/>
+      <w:lvlJc w:val="left"/>
+      <w:pPr>
+        <w:tabs>
+          <w:tab w:val="num" w:pos="4668"/>
+        </w:tabs>
+        <w:ind w:left="4668" w:hanging="360"/>
+      </w:pPr>
+      <w:rPr>
+        <w:rFonts w:ascii="Wingdings" w:hAnsi="Wingdings" w:hint="default"/>
+        <w:sz w:val="20"/>
+      </w:rPr>
+    </w:lvl>
+    <w:lvl w:ilvl="6" w:tentative="1">
+      <w:start w:val="1"/>
+      <w:numFmt w:val="bullet"/>
+      <w:lvlText w:val=""/>
+      <w:lvlJc w:val="left"/>
+      <w:pPr>
+        <w:tabs>
+          <w:tab w:val="num" w:pos="5388"/>
+        </w:tabs>
+        <w:ind w:left="5388" w:hanging="360"/>
+      </w:pPr>
+      <w:rPr>
+        <w:rFonts w:ascii="Wingdings" w:hAnsi="Wingdings" w:hint="default"/>
+        <w:sz w:val="20"/>
+      </w:rPr>
+    </w:lvl>
+    <w:lvl w:ilvl="7" w:tentative="1">
+      <w:start w:val="1"/>
+      <w:numFmt w:val="bullet"/>
+      <w:lvlText w:val=""/>
+      <w:lvlJc w:val="left"/>
+      <w:pPr>
+        <w:tabs>
+          <w:tab w:val="num" w:pos="6108"/>
+        </w:tabs>
+        <w:ind w:left="6108" w:hanging="360"/>
+      </w:pPr>
+      <w:rPr>
+        <w:rFonts w:ascii="Wingdings" w:hAnsi="Wingdings" w:hint="default"/>
+        <w:sz w:val="20"/>
+      </w:rPr>
+    </w:lvl>
+    <w:lvl w:ilvl="8" w:tentative="1">
+      <w:start w:val="1"/>
+      <w:numFmt w:val="bullet"/>
+      <w:lvlText w:val=""/>
+      <w:lvlJc w:val="left"/>
+      <w:pPr>
+        <w:tabs>
+          <w:tab w:val="num" w:pos="6828"/>
+        </w:tabs>
+        <w:ind w:left="6828" w:hanging="360"/>
+      </w:pPr>
+      <w:rPr>
+        <w:rFonts w:ascii="Wingdings" w:hAnsi="Wingdings" w:hint="default"/>
+        <w:sz w:val="20"/>
+      </w:rPr>
+    </w:lvl>
+  </w:abstractNum>
+  <w:abstractNum w:abstractNumId="4" w15:restartNumberingAfterBreak="0">
+    <w:nsid w:val="44326311"/>
+    <w:multiLevelType w:val="multilevel"/>
+    <w:tmpl w:val="BA46C726"/>
+    <w:lvl w:ilvl="0">
+      <w:start w:val="1"/>
+      <w:numFmt w:val="bullet"/>
+      <w:lvlText w:val=""/>
+      <w:lvlJc w:val="left"/>
+      <w:pPr>
+        <w:tabs>
+          <w:tab w:val="num" w:pos="720"/>
+        </w:tabs>
+        <w:ind w:left="720" w:hanging="360"/>
+      </w:pPr>
+      <w:rPr>
+        <w:rFonts w:ascii="Symbol" w:hAnsi="Symbol" w:hint="default"/>
+        <w:sz w:val="20"/>
+      </w:rPr>
+    </w:lvl>
+    <w:lvl w:ilvl="1">
+      <w:start w:val="1"/>
+      <w:numFmt w:val="bullet"/>
+      <w:lvlText w:val="o"/>
+      <w:lvlJc w:val="left"/>
+      <w:pPr>
+        <w:tabs>
+          <w:tab w:val="num" w:pos="1440"/>
+        </w:tabs>
+        <w:ind w:left="1440" w:hanging="360"/>
+      </w:pPr>
+      <w:rPr>
+        <w:rFonts w:ascii="Courier New" w:hAnsi="Courier New" w:hint="default"/>
+        <w:sz w:val="20"/>
+      </w:rPr>
+    </w:lvl>
+    <w:lvl w:ilvl="2" w:tentative="1">
+      <w:start w:val="1"/>
+      <w:numFmt w:val="bullet"/>
+      <w:lvlText w:val=""/>
+      <w:lvlJc w:val="left"/>
+      <w:pPr>
+        <w:tabs>
+          <w:tab w:val="num" w:pos="2160"/>
+        </w:tabs>
+        <w:ind w:left="2160" w:hanging="360"/>
+      </w:pPr>
+      <w:rPr>
+        <w:rFonts w:ascii="Wingdings" w:hAnsi="Wingdings" w:hint="default"/>
+        <w:sz w:val="20"/>
+      </w:rPr>
+    </w:lvl>
+    <w:lvl w:ilvl="3" w:tentative="1">
+      <w:start w:val="1"/>
+      <w:numFmt w:val="bullet"/>
+      <w:lvlText w:val=""/>
+      <w:lvlJc w:val="left"/>
+      <w:pPr>
+        <w:tabs>
+          <w:tab w:val="num" w:pos="2880"/>
+        </w:tabs>
+        <w:ind w:left="2880" w:hanging="360"/>
+      </w:pPr>
+      <w:rPr>
+        <w:rFonts w:ascii="Wingdings" w:hAnsi="Wingdings" w:hint="default"/>
+        <w:sz w:val="20"/>
+      </w:rPr>
+    </w:lvl>
+    <w:lvl w:ilvl="4" w:tentative="1">
+      <w:start w:val="1"/>
+      <w:numFmt w:val="bullet"/>
+      <w:lvlText w:val=""/>
+      <w:lvlJc w:val="left"/>
+      <w:pPr>
+        <w:tabs>
+          <w:tab w:val="num" w:pos="3600"/>
+        </w:tabs>
+        <w:ind w:left="3600" w:hanging="360"/>
+      </w:pPr>
+      <w:rPr>
+        <w:rFonts w:ascii="Wingdings" w:hAnsi="Wingdings" w:hint="default"/>
+        <w:sz w:val="20"/>
+      </w:rPr>
+    </w:lvl>
+    <w:lvl w:ilvl="5" w:tentative="1">
+      <w:start w:val="1"/>
+      <w:numFmt w:val="bullet"/>
+      <w:lvlText w:val=""/>
+      <w:lvlJc w:val="left"/>
+      <w:pPr>
+        <w:tabs>
+          <w:tab w:val="num" w:pos="4320"/>
+        </w:tabs>
+        <w:ind w:left="4320" w:hanging="360"/>
+      </w:pPr>
+      <w:rPr>
+        <w:rFonts w:ascii="Wingdings" w:hAnsi="Wingdings" w:hint="default"/>
+        <w:sz w:val="20"/>
+      </w:rPr>
+    </w:lvl>
+    <w:lvl w:ilvl="6" w:tentative="1">
+      <w:start w:val="1"/>
+      <w:numFmt w:val="bullet"/>
+      <w:lvlText w:val=""/>
+      <w:lvlJc w:val="left"/>
+      <w:pPr>
+        <w:tabs>
+          <w:tab w:val="num" w:pos="5040"/>
+        </w:tabs>
+        <w:ind w:left="5040" w:hanging="360"/>
+      </w:pPr>
+      <w:rPr>
+        <w:rFonts w:ascii="Wingdings" w:hAnsi="Wingdings" w:hint="default"/>
+        <w:sz w:val="20"/>
+      </w:rPr>
+    </w:lvl>
+    <w:lvl w:ilvl="7" w:tentative="1">
+      <w:start w:val="1"/>
+      <w:numFmt w:val="bullet"/>
+      <w:lvlText w:val=""/>
+      <w:lvlJc w:val="left"/>
+      <w:pPr>
+        <w:tabs>
+          <w:tab w:val="num" w:pos="5760"/>
+        </w:tabs>
+        <w:ind w:left="5760" w:hanging="360"/>
+      </w:pPr>
+      <w:rPr>
+        <w:rFonts w:ascii="Wingdings" w:hAnsi="Wingdings" w:hint="default"/>
+        <w:sz w:val="20"/>
+      </w:rPr>
+    </w:lvl>
+    <w:lvl w:ilvl="8" w:tentative="1">
+      <w:start w:val="1"/>
+      <w:numFmt w:val="bullet"/>
+      <w:lvlText w:val=""/>
+      <w:lvlJc w:val="left"/>
+      <w:pPr>
+        <w:tabs>
+          <w:tab w:val="num" w:pos="6480"/>
+        </w:tabs>
+        <w:ind w:left="6480" w:hanging="360"/>
+      </w:pPr>
+      <w:rPr>
+        <w:rFonts w:ascii="Wingdings" w:hAnsi="Wingdings" w:hint="default"/>
+        <w:sz w:val="20"/>
+      </w:rPr>
+    </w:lvl>
+  </w:abstractNum>
+  <w:abstractNum w:abstractNumId="5" w15:restartNumberingAfterBreak="0">
     <w:nsid w:val="4B2F1E2B"/>
     <w:multiLevelType w:val="hybridMultilevel"/>
-    <w:tmpl w:val="263C3718"/>
+    <w:tmpl w:val="AB2AD558"/>
     <w:lvl w:ilvl="0" w:tplc="0C0A0001">
       <w:start w:val="1"/>
       <w:numFmt w:val="bullet"/>
@@ -2090,7 +4171,7 @@
       </w:rPr>
     </w:lvl>
   </w:abstractNum>
-  <w:abstractNum w:abstractNumId="1" w15:restartNumberingAfterBreak="0">
+  <w:abstractNum w:abstractNumId="6" w15:restartNumberingAfterBreak="0">
     <w:nsid w:val="5F022162"/>
     <w:multiLevelType w:val="hybridMultilevel"/>
     <w:tmpl w:val="E958538A"/>
@@ -2180,10 +4261,25 @@
     </w:lvl>
   </w:abstractNum>
   <w:num w:numId="1" w16cid:durableId="868301153">
+    <w:abstractNumId w:val="6"/>
+  </w:num>
+  <w:num w:numId="2" w16cid:durableId="569509222">
+    <w:abstractNumId w:val="5"/>
+  </w:num>
+  <w:num w:numId="3" w16cid:durableId="936986190">
+    <w:abstractNumId w:val="4"/>
+  </w:num>
+  <w:num w:numId="4" w16cid:durableId="421031705">
     <w:abstractNumId w:val="1"/>
   </w:num>
-  <w:num w:numId="2" w16cid:durableId="569509222">
+  <w:num w:numId="5" w16cid:durableId="1977878454">
     <w:abstractNumId w:val="0"/>
+  </w:num>
+  <w:num w:numId="6" w16cid:durableId="1463579058">
+    <w:abstractNumId w:val="3"/>
+  </w:num>
+  <w:num w:numId="7" w16cid:durableId="237256106">
+    <w:abstractNumId w:val="2"/>
   </w:num>
 </w:numbering>
 </file>
@@ -2790,7 +4886,6 @@
   <w:style w:type="character" w:default="1" w:styleId="Fuentedeprrafopredeter">
     <w:name w:val="Default Paragraph Font"/>
     <w:uiPriority w:val="1"/>
-    <w:semiHidden/>
     <w:unhideWhenUsed/>
   </w:style>
   <w:style w:type="table" w:default="1" w:styleId="Tablanormal">

</xml_diff>